<commit_message>
Boomi MFT platform page v0.3 (draft): expand section 6 with site (6.1) and instance (6.2) descriptions, instance order Tax, Valuation Office, Borders and Trade, D-ENV-05 and D-ENV-06; Figure 3 reordered
Co-Authored-By: Claude Opus 5.5 <noreply@anthropic.com>
Claude-Session: https://claude.ai/code/session_01PPFc7XwZnyxxa3evFXiTE9
</commit_message>
<xml_diff>
--- a/assets/boomi-mft-platform-overview.docx
+++ b/assets/boomi-mft-platform-overview.docx
@@ -80,7 +80,7 @@
                 <w:sz w:val="19"/>
                 <w:szCs w:val="19"/>
               </w:rPr>
-              <w:t xml:space="preserve">Draft v0.2 (draft), 22 October 2026</w:t>
+              <w:t xml:space="preserve">Draft v0.3 (draft), 22 October 2026</w:t>
             </w:r>
           </w:p>
         </w:tc>
@@ -316,7 +316,7 @@
                 <w:sz w:val="19"/>
                 <w:szCs w:val="19"/>
               </w:rPr>
-              <w:t xml:space="preserve">v0.1: sections 1 to 5 and gaps, principles, references. v0.2: adds section 6 (instances and environments), 7 (roles and access) and 8 (naming conventions)</w:t>
+              <w:t xml:space="preserve">v0.1: sections 1 to 5 and gaps, principles, references. v0.2: adds section 6 (instances and environments), 7 (roles and access) and 8 (naming conventions). v0.3: expands section 6 with fuller site and instance descriptions</w:t>
             </w:r>
           </w:p>
         </w:tc>
@@ -5697,7 +5697,7 @@
         <w:spacing w:after="120"/>
       </w:pPr>
       <w:r>
-        <w:t xml:space="preserve">Boomi MFT separates work at four levels: site, instance, organization, and the endpoints, users and machine users inside an organization. The programme runs four environments. Each environment is its own site with its own base URL, and each site hosts the same three instances: Tax, Borders and Trade, and Valuation Office. That gives 12 instances in total, all built to the same pattern.</w:t>
+        <w:t xml:space="preserve">Boomi MFT separates work at four levels: site, instance, organization, and the endpoints, users and machine users inside an organization. This section covers the first two. Organizations and roles are covered in section 7.</w:t>
       </w:r>
     </w:p>
     <w:p>
@@ -5766,1233 +5766,83 @@
         <w:pStyle w:val="Heading2"/>
       </w:pPr>
       <w:r>
-        <w:t xml:space="preserve">6.1 How Boomi MFT separates work</w:t>
+        <w:t xml:space="preserve">6.1 Site</w:t>
       </w:r>
-    </w:p>
-    <w:tbl>
-      <w:tblPr>
-        <w:tblW w:type="dxa" w:w="9638"/>
-        <w:tblBorders>
-          <w:top w:val="single" w:color="auto" w:sz="4"/>
-          <w:left w:val="single" w:color="auto" w:sz="4"/>
-          <w:bottom w:val="single" w:color="auto" w:sz="4"/>
-          <w:right w:val="single" w:color="auto" w:sz="4"/>
-          <w:insideH w:val="single" w:color="auto" w:sz="4"/>
-          <w:insideV w:val="single" w:color="auto" w:sz="4"/>
-        </w:tblBorders>
-      </w:tblPr>
-      <w:tblGrid>
-        <w:gridCol w:w="1570"/>
-        <w:gridCol w:w="4472"/>
-        <w:gridCol w:w="3596"/>
-      </w:tblGrid>
-      <w:tr>
-        <w:trPr>
-          <w:tblHeader/>
-        </w:trPr>
-        <w:tc>
-          <w:tcPr>
-            <w:tcW w:type="dxa" w:w="1570"/>
-            <w:tcBorders>
-              <w:top w:val="single" w:color="C5CCD3" w:sz="4"/>
-              <w:left w:val="single" w:color="C5CCD3" w:sz="4"/>
-              <w:bottom w:val="single" w:color="C5CCD3" w:sz="4"/>
-              <w:right w:val="single" w:color="C5CCD3" w:sz="4"/>
-            </w:tcBorders>
-            <w:shd w:fill="E8F0FA" w:color="auto" w:val="clear"/>
-            <w:tcMar>
-              <w:top w:type="dxa" w:w="60"/>
-              <w:left w:type="dxa" w:w="100"/>
-              <w:bottom w:type="dxa" w:w="60"/>
-              <w:right w:type="dxa" w:w="100"/>
-            </w:tcMar>
-          </w:tcPr>
-          <w:p>
-            <w:r>
-              <w:rPr>
-                <w:b/>
-                <w:bCs/>
-                <w:sz w:val="19"/>
-                <w:szCs w:val="19"/>
-              </w:rPr>
-              <w:t xml:space="preserve">Level</w:t>
-            </w:r>
-          </w:p>
-        </w:tc>
-        <w:tc>
-          <w:tcPr>
-            <w:tcW w:type="dxa" w:w="4472"/>
-            <w:tcBorders>
-              <w:top w:val="single" w:color="C5CCD3" w:sz="4"/>
-              <w:left w:val="single" w:color="C5CCD3" w:sz="4"/>
-              <w:bottom w:val="single" w:color="C5CCD3" w:sz="4"/>
-              <w:right w:val="single" w:color="C5CCD3" w:sz="4"/>
-            </w:tcBorders>
-            <w:shd w:fill="E8F0FA" w:color="auto" w:val="clear"/>
-            <w:tcMar>
-              <w:top w:type="dxa" w:w="60"/>
-              <w:left w:type="dxa" w:w="100"/>
-              <w:bottom w:type="dxa" w:w="60"/>
-              <w:right w:type="dxa" w:w="100"/>
-            </w:tcMar>
-          </w:tcPr>
-          <w:p>
-            <w:r>
-              <w:rPr>
-                <w:b/>
-                <w:bCs/>
-                <w:sz w:val="19"/>
-                <w:szCs w:val="19"/>
-              </w:rPr>
-              <w:t xml:space="preserve">What it is</w:t>
-            </w:r>
-          </w:p>
-        </w:tc>
-        <w:tc>
-          <w:tcPr>
-            <w:tcW w:type="dxa" w:w="3596"/>
-            <w:tcBorders>
-              <w:top w:val="single" w:color="C5CCD3" w:sz="4"/>
-              <w:left w:val="single" w:color="C5CCD3" w:sz="4"/>
-              <w:bottom w:val="single" w:color="C5CCD3" w:sz="4"/>
-              <w:right w:val="single" w:color="C5CCD3" w:sz="4"/>
-            </w:tcBorders>
-            <w:shd w:fill="E8F0FA" w:color="auto" w:val="clear"/>
-            <w:tcMar>
-              <w:top w:type="dxa" w:w="60"/>
-              <w:left w:type="dxa" w:w="100"/>
-              <w:bottom w:type="dxa" w:w="60"/>
-              <w:right w:type="dxa" w:w="100"/>
-            </w:tcMar>
-          </w:tcPr>
-          <w:p>
-            <w:r>
-              <w:rPr>
-                <w:b/>
-                <w:bCs/>
-                <w:sz w:val="19"/>
-                <w:szCs w:val="19"/>
-              </w:rPr>
-              <w:t xml:space="preserve">On the programme</w:t>
-            </w:r>
-          </w:p>
-        </w:tc>
-      </w:tr>
-      <w:tr>
-        <w:tc>
-          <w:tcPr>
-            <w:tcW w:type="dxa" w:w="1570"/>
-            <w:tcBorders>
-              <w:top w:val="single" w:color="C5CCD3" w:sz="4"/>
-              <w:left w:val="single" w:color="C5CCD3" w:sz="4"/>
-              <w:bottom w:val="single" w:color="C5CCD3" w:sz="4"/>
-              <w:right w:val="single" w:color="C5CCD3" w:sz="4"/>
-            </w:tcBorders>
-            <w:tcMar>
-              <w:top w:type="dxa" w:w="60"/>
-              <w:left w:type="dxa" w:w="100"/>
-              <w:bottom w:type="dxa" w:w="60"/>
-              <w:right w:type="dxa" w:w="100"/>
-            </w:tcMar>
-          </w:tcPr>
-          <w:p>
-            <w:r>
-              <w:rPr>
-                <w:b w:val="false"/>
-                <w:bCs w:val="false"/>
-                <w:sz w:val="19"/>
-                <w:szCs w:val="19"/>
-              </w:rPr>
-              <w:t xml:space="preserve">Site</w:t>
-            </w:r>
-          </w:p>
-        </w:tc>
-        <w:tc>
-          <w:tcPr>
-            <w:tcW w:type="dxa" w:w="4472"/>
-            <w:tcBorders>
-              <w:top w:val="single" w:color="C5CCD3" w:sz="4"/>
-              <w:left w:val="single" w:color="C5CCD3" w:sz="4"/>
-              <w:bottom w:val="single" w:color="C5CCD3" w:sz="4"/>
-              <w:right w:val="single" w:color="C5CCD3" w:sz="4"/>
-            </w:tcBorders>
-            <w:tcMar>
-              <w:top w:type="dxa" w:w="60"/>
-              <w:left w:type="dxa" w:w="100"/>
-              <w:bottom w:type="dxa" w:w="60"/>
-              <w:right w:type="dxa" w:w="100"/>
-            </w:tcMar>
-          </w:tcPr>
-          <w:p>
-            <w:r>
-              <w:rPr>
-                <w:b w:val="false"/>
-                <w:bCs w:val="false"/>
-                <w:sz w:val="19"/>
-                <w:szCs w:val="19"/>
-              </w:rPr>
-              <w:t xml:space="preserve">One regional deployment, addressed by a single base URL. A site can host one or many instances.</w:t>
-            </w:r>
-          </w:p>
-        </w:tc>
-        <w:tc>
-          <w:tcPr>
-            <w:tcW w:type="dxa" w:w="3596"/>
-            <w:tcBorders>
-              <w:top w:val="single" w:color="C5CCD3" w:sz="4"/>
-              <w:left w:val="single" w:color="C5CCD3" w:sz="4"/>
-              <w:bottom w:val="single" w:color="C5CCD3" w:sz="4"/>
-              <w:right w:val="single" w:color="C5CCD3" w:sz="4"/>
-            </w:tcBorders>
-            <w:tcMar>
-              <w:top w:type="dxa" w:w="60"/>
-              <w:left w:type="dxa" w:w="100"/>
-              <w:bottom w:type="dxa" w:w="60"/>
-              <w:right w:type="dxa" w:w="100"/>
-            </w:tcMar>
-          </w:tcPr>
-          <w:p>
-            <w:r>
-              <w:rPr>
-                <w:b w:val="false"/>
-                <w:bCs w:val="false"/>
-                <w:sz w:val="19"/>
-                <w:szCs w:val="19"/>
-              </w:rPr>
-              <w:t xml:space="preserve">One site per environment: dev, test, pre-prod and prod.</w:t>
-            </w:r>
-          </w:p>
-        </w:tc>
-      </w:tr>
-      <w:tr>
-        <w:tc>
-          <w:tcPr>
-            <w:tcW w:type="dxa" w:w="1570"/>
-            <w:tcBorders>
-              <w:top w:val="single" w:color="C5CCD3" w:sz="4"/>
-              <w:left w:val="single" w:color="C5CCD3" w:sz="4"/>
-              <w:bottom w:val="single" w:color="C5CCD3" w:sz="4"/>
-              <w:right w:val="single" w:color="C5CCD3" w:sz="4"/>
-            </w:tcBorders>
-            <w:tcMar>
-              <w:top w:type="dxa" w:w="60"/>
-              <w:left w:type="dxa" w:w="100"/>
-              <w:bottom w:type="dxa" w:w="60"/>
-              <w:right w:type="dxa" w:w="100"/>
-            </w:tcMar>
-          </w:tcPr>
-          <w:p>
-            <w:r>
-              <w:rPr>
-                <w:b w:val="false"/>
-                <w:bCs w:val="false"/>
-                <w:sz w:val="19"/>
-                <w:szCs w:val="19"/>
-              </w:rPr>
-              <w:t xml:space="preserve">Instance</w:t>
-            </w:r>
-          </w:p>
-        </w:tc>
-        <w:tc>
-          <w:tcPr>
-            <w:tcW w:type="dxa" w:w="4472"/>
-            <w:tcBorders>
-              <w:top w:val="single" w:color="C5CCD3" w:sz="4"/>
-              <w:left w:val="single" w:color="C5CCD3" w:sz="4"/>
-              <w:bottom w:val="single" w:color="C5CCD3" w:sz="4"/>
-              <w:right w:val="single" w:color="C5CCD3" w:sz="4"/>
-            </w:tcBorders>
-            <w:tcMar>
-              <w:top w:type="dxa" w:w="60"/>
-              <w:left w:type="dxa" w:w="100"/>
-              <w:bottom w:type="dxa" w:w="60"/>
-              <w:right w:type="dxa" w:w="100"/>
-            </w:tcMar>
-          </w:tcPr>
-          <w:p>
-            <w:r>
-              <w:rPr>
-                <w:b w:val="false"/>
-                <w:bCs w:val="false"/>
-                <w:sz w:val="19"/>
-                <w:szCs w:val="19"/>
-              </w:rPr>
-              <w:t xml:space="preserve">A logically isolated tenant. It cannot see or touch another instance's data, configuration or users.</w:t>
-            </w:r>
-          </w:p>
-        </w:tc>
-        <w:tc>
-          <w:tcPr>
-            <w:tcW w:type="dxa" w:w="3596"/>
-            <w:tcBorders>
-              <w:top w:val="single" w:color="C5CCD3" w:sz="4"/>
-              <w:left w:val="single" w:color="C5CCD3" w:sz="4"/>
-              <w:bottom w:val="single" w:color="C5CCD3" w:sz="4"/>
-              <w:right w:val="single" w:color="C5CCD3" w:sz="4"/>
-            </w:tcBorders>
-            <w:tcMar>
-              <w:top w:type="dxa" w:w="60"/>
-              <w:left w:type="dxa" w:w="100"/>
-              <w:bottom w:type="dxa" w:w="60"/>
-              <w:right w:type="dxa" w:w="100"/>
-            </w:tcMar>
-          </w:tcPr>
-          <w:p>
-            <w:r>
-              <w:rPr>
-                <w:b w:val="false"/>
-                <w:bCs w:val="false"/>
-                <w:sz w:val="19"/>
-                <w:szCs w:val="19"/>
-              </w:rPr>
-              <w:t xml:space="preserve">Three instances in every site: Tax, Borders and Trade, Valuation Office.</w:t>
-            </w:r>
-          </w:p>
-        </w:tc>
-      </w:tr>
-      <w:tr>
-        <w:tc>
-          <w:tcPr>
-            <w:tcW w:type="dxa" w:w="1570"/>
-            <w:tcBorders>
-              <w:top w:val="single" w:color="C5CCD3" w:sz="4"/>
-              <w:left w:val="single" w:color="C5CCD3" w:sz="4"/>
-              <w:bottom w:val="single" w:color="C5CCD3" w:sz="4"/>
-              <w:right w:val="single" w:color="C5CCD3" w:sz="4"/>
-            </w:tcBorders>
-            <w:tcMar>
-              <w:top w:type="dxa" w:w="60"/>
-              <w:left w:type="dxa" w:w="100"/>
-              <w:bottom w:type="dxa" w:w="60"/>
-              <w:right w:type="dxa" w:w="100"/>
-            </w:tcMar>
-          </w:tcPr>
-          <w:p>
-            <w:r>
-              <w:rPr>
-                <w:b w:val="false"/>
-                <w:bCs w:val="false"/>
-                <w:sz w:val="19"/>
-                <w:szCs w:val="19"/>
-              </w:rPr>
-              <w:t xml:space="preserve">Organization</w:t>
-            </w:r>
-          </w:p>
-        </w:tc>
-        <w:tc>
-          <w:tcPr>
-            <w:tcW w:type="dxa" w:w="4472"/>
-            <w:tcBorders>
-              <w:top w:val="single" w:color="C5CCD3" w:sz="4"/>
-              <w:left w:val="single" w:color="C5CCD3" w:sz="4"/>
-              <w:bottom w:val="single" w:color="C5CCD3" w:sz="4"/>
-              <w:right w:val="single" w:color="C5CCD3" w:sz="4"/>
-            </w:tcBorders>
-            <w:tcMar>
-              <w:top w:type="dxa" w:w="60"/>
-              <w:left w:type="dxa" w:w="100"/>
-              <w:bottom w:type="dxa" w:w="60"/>
-              <w:right w:type="dxa" w:w="100"/>
-            </w:tcMar>
-          </w:tcPr>
-          <w:p>
-            <w:r>
-              <w:rPr>
-                <w:b w:val="false"/>
-                <w:bCs w:val="false"/>
-                <w:sz w:val="19"/>
-                <w:szCs w:val="19"/>
-              </w:rPr>
-              <w:t xml:space="preserve">An entity inside an instance, such as a business unit, product team or trading partner. It owns its own connections, flows and keys.</w:t>
-            </w:r>
-          </w:p>
-        </w:tc>
-        <w:tc>
-          <w:tcPr>
-            <w:tcW w:type="dxa" w:w="3596"/>
-            <w:tcBorders>
-              <w:top w:val="single" w:color="C5CCD3" w:sz="4"/>
-              <w:left w:val="single" w:color="C5CCD3" w:sz="4"/>
-              <w:bottom w:val="single" w:color="C5CCD3" w:sz="4"/>
-              <w:right w:val="single" w:color="C5CCD3" w:sz="4"/>
-            </w:tcBorders>
-            <w:tcMar>
-              <w:top w:type="dxa" w:w="60"/>
-              <w:left w:type="dxa" w:w="100"/>
-              <w:bottom w:type="dxa" w:w="60"/>
-              <w:right w:type="dxa" w:w="100"/>
-            </w:tcMar>
-          </w:tcPr>
-          <w:p>
-            <w:r>
-              <w:rPr>
-                <w:b w:val="false"/>
-                <w:bCs w:val="false"/>
-                <w:sz w:val="19"/>
-                <w:szCs w:val="19"/>
-              </w:rPr>
-              <w:t xml:space="preserve">One organization per product team or partner, created by the iPaaS team (section 7).</w:t>
-            </w:r>
-          </w:p>
-        </w:tc>
-      </w:tr>
-      <w:tr>
-        <w:tc>
-          <w:tcPr>
-            <w:tcW w:type="dxa" w:w="1570"/>
-            <w:tcBorders>
-              <w:top w:val="single" w:color="C5CCD3" w:sz="4"/>
-              <w:left w:val="single" w:color="C5CCD3" w:sz="4"/>
-              <w:bottom w:val="single" w:color="C5CCD3" w:sz="4"/>
-              <w:right w:val="single" w:color="C5CCD3" w:sz="4"/>
-            </w:tcBorders>
-            <w:tcMar>
-              <w:top w:type="dxa" w:w="60"/>
-              <w:left w:type="dxa" w:w="100"/>
-              <w:bottom w:type="dxa" w:w="60"/>
-              <w:right w:type="dxa" w:w="100"/>
-            </w:tcMar>
-          </w:tcPr>
-          <w:p>
-            <w:r>
-              <w:rPr>
-                <w:b w:val="false"/>
-                <w:bCs w:val="false"/>
-                <w:sz w:val="19"/>
-                <w:szCs w:val="19"/>
-              </w:rPr>
-              <w:t xml:space="preserve">Endpoints, users and machine users</w:t>
-            </w:r>
-          </w:p>
-        </w:tc>
-        <w:tc>
-          <w:tcPr>
-            <w:tcW w:type="dxa" w:w="4472"/>
-            <w:tcBorders>
-              <w:top w:val="single" w:color="C5CCD3" w:sz="4"/>
-              <w:left w:val="single" w:color="C5CCD3" w:sz="4"/>
-              <w:bottom w:val="single" w:color="C5CCD3" w:sz="4"/>
-              <w:right w:val="single" w:color="C5CCD3" w:sz="4"/>
-            </w:tcBorders>
-            <w:tcMar>
-              <w:top w:type="dxa" w:w="60"/>
-              <w:left w:type="dxa" w:w="100"/>
-              <w:bottom w:type="dxa" w:w="60"/>
-              <w:right w:type="dxa" w:w="100"/>
-            </w:tcMar>
-          </w:tcPr>
-          <w:p>
-            <w:r>
-              <w:rPr>
-                <w:b w:val="false"/>
-                <w:bCs w:val="false"/>
-                <w:sz w:val="19"/>
-                <w:szCs w:val="19"/>
-              </w:rPr>
-              <w:t xml:space="preserve">An organization's connection points, human accounts and service accounts. Each is scoped to that organization only.</w:t>
-            </w:r>
-          </w:p>
-        </w:tc>
-        <w:tc>
-          <w:tcPr>
-            <w:tcW w:type="dxa" w:w="3596"/>
-            <w:tcBorders>
-              <w:top w:val="single" w:color="C5CCD3" w:sz="4"/>
-              <w:left w:val="single" w:color="C5CCD3" w:sz="4"/>
-              <w:bottom w:val="single" w:color="C5CCD3" w:sz="4"/>
-              <w:right w:val="single" w:color="C5CCD3" w:sz="4"/>
-            </w:tcBorders>
-            <w:tcMar>
-              <w:top w:type="dxa" w:w="60"/>
-              <w:left w:type="dxa" w:w="100"/>
-              <w:bottom w:type="dxa" w:w="60"/>
-              <w:right w:type="dxa" w:w="100"/>
-            </w:tcMar>
-          </w:tcPr>
-          <w:p>
-            <w:r>
-              <w:rPr>
-                <w:b w:val="false"/>
-                <w:bCs w:val="false"/>
-                <w:sz w:val="19"/>
-                <w:szCs w:val="19"/>
-              </w:rPr>
-              <w:t xml:space="preserve">Endpoints are created by the team's Standard_Admin, flows by its Standard_User (section 7).</w:t>
-            </w:r>
-          </w:p>
-        </w:tc>
-      </w:tr>
-    </w:tbl>
-    <w:p>
-      <w:pPr>
-        <w:spacing w:after="60"/>
-      </w:pPr>
     </w:p>
     <w:p>
       <w:pPr>
-        <w:pStyle w:val="Heading2"/>
+        <w:spacing w:after="120"/>
       </w:pPr>
       <w:r>
-        <w:t xml:space="preserve">6.2 Environments</w:t>
+        <w:t xml:space="preserve">A site is one regional deployment of Boomi MFT, addressed by a single base URL, that can host one or many instances. Everything people and systems do in MFT starts from that URL: signing in to the portal, connecting to the SFTP, FTPS and HTTPS servers that MFT hosts, opening File Sharing links and Dropbox pages, calling the MFT APIs, and MFT Nodes connecting back to the cloud.</w:t>
       </w:r>
-    </w:p>
-    <w:tbl>
-      <w:tblPr>
-        <w:tblW w:type="dxa" w:w="9638"/>
-        <w:tblBorders>
-          <w:top w:val="single" w:color="auto" w:sz="4"/>
-          <w:left w:val="single" w:color="auto" w:sz="4"/>
-          <w:bottom w:val="single" w:color="auto" w:sz="4"/>
-          <w:right w:val="single" w:color="auto" w:sz="4"/>
-          <w:insideH w:val="single" w:color="auto" w:sz="4"/>
-          <w:insideV w:val="single" w:color="auto" w:sz="4"/>
-        </w:tblBorders>
-      </w:tblPr>
-      <w:tblGrid>
-        <w:gridCol w:w="1752"/>
-        <w:gridCol w:w="1943"/>
-        <w:gridCol w:w="2116"/>
-        <w:gridCol w:w="1889"/>
-        <w:gridCol w:w="1938"/>
-      </w:tblGrid>
-      <w:tr>
-        <w:trPr>
-          <w:tblHeader/>
-        </w:trPr>
-        <w:tc>
-          <w:tcPr>
-            <w:tcW w:type="dxa" w:w="1752"/>
-            <w:tcBorders>
-              <w:top w:val="single" w:color="C5CCD3" w:sz="4"/>
-              <w:left w:val="single" w:color="C5CCD3" w:sz="4"/>
-              <w:bottom w:val="single" w:color="C5CCD3" w:sz="4"/>
-              <w:right w:val="single" w:color="C5CCD3" w:sz="4"/>
-            </w:tcBorders>
-            <w:shd w:fill="E8F0FA" w:color="auto" w:val="clear"/>
-            <w:tcMar>
-              <w:top w:type="dxa" w:w="60"/>
-              <w:left w:type="dxa" w:w="100"/>
-              <w:bottom w:type="dxa" w:w="60"/>
-              <w:right w:type="dxa" w:w="100"/>
-            </w:tcMar>
-          </w:tcPr>
-          <w:p>
-            <w:r>
-              <w:rPr>
-                <w:b/>
-                <w:bCs/>
-                <w:sz w:val="19"/>
-                <w:szCs w:val="19"/>
-              </w:rPr>
-              <w:t xml:space="preserve">Environment</w:t>
-            </w:r>
-          </w:p>
-        </w:tc>
-        <w:tc>
-          <w:tcPr>
-            <w:tcW w:type="dxa" w:w="1943"/>
-            <w:tcBorders>
-              <w:top w:val="single" w:color="C5CCD3" w:sz="4"/>
-              <w:left w:val="single" w:color="C5CCD3" w:sz="4"/>
-              <w:bottom w:val="single" w:color="C5CCD3" w:sz="4"/>
-              <w:right w:val="single" w:color="C5CCD3" w:sz="4"/>
-            </w:tcBorders>
-            <w:shd w:fill="E8F0FA" w:color="auto" w:val="clear"/>
-            <w:tcMar>
-              <w:top w:type="dxa" w:w="60"/>
-              <w:left w:type="dxa" w:w="100"/>
-              <w:bottom w:type="dxa" w:w="60"/>
-              <w:right w:type="dxa" w:w="100"/>
-            </w:tcMar>
-          </w:tcPr>
-          <w:p>
-            <w:r>
-              <w:rPr>
-                <w:b/>
-                <w:bCs/>
-                <w:sz w:val="19"/>
-                <w:szCs w:val="19"/>
-              </w:rPr>
-              <w:t xml:space="preserve">Site base URL (proposed)</w:t>
-            </w:r>
-          </w:p>
-        </w:tc>
-        <w:tc>
-          <w:tcPr>
-            <w:tcW w:type="dxa" w:w="2116"/>
-            <w:tcBorders>
-              <w:top w:val="single" w:color="C5CCD3" w:sz="4"/>
-              <w:left w:val="single" w:color="C5CCD3" w:sz="4"/>
-              <w:bottom w:val="single" w:color="C5CCD3" w:sz="4"/>
-              <w:right w:val="single" w:color="C5CCD3" w:sz="4"/>
-            </w:tcBorders>
-            <w:shd w:fill="E8F0FA" w:color="auto" w:val="clear"/>
-            <w:tcMar>
-              <w:top w:type="dxa" w:w="60"/>
-              <w:left w:type="dxa" w:w="100"/>
-              <w:bottom w:type="dxa" w:w="60"/>
-              <w:right w:type="dxa" w:w="100"/>
-            </w:tcMar>
-          </w:tcPr>
-          <w:p>
-            <w:r>
-              <w:rPr>
-                <w:b/>
-                <w:bCs/>
-                <w:sz w:val="19"/>
-                <w:szCs w:val="19"/>
-              </w:rPr>
-              <w:t xml:space="preserve">Purpose</w:t>
-            </w:r>
-          </w:p>
-        </w:tc>
-        <w:tc>
-          <w:tcPr>
-            <w:tcW w:type="dxa" w:w="1889"/>
-            <w:tcBorders>
-              <w:top w:val="single" w:color="C5CCD3" w:sz="4"/>
-              <w:left w:val="single" w:color="C5CCD3" w:sz="4"/>
-              <w:bottom w:val="single" w:color="C5CCD3" w:sz="4"/>
-              <w:right w:val="single" w:color="C5CCD3" w:sz="4"/>
-            </w:tcBorders>
-            <w:shd w:fill="E8F0FA" w:color="auto" w:val="clear"/>
-            <w:tcMar>
-              <w:top w:type="dxa" w:w="60"/>
-              <w:left w:type="dxa" w:w="100"/>
-              <w:bottom w:type="dxa" w:w="60"/>
-              <w:right w:type="dxa" w:w="100"/>
-            </w:tcMar>
-          </w:tcPr>
-          <w:p>
-            <w:r>
-              <w:rPr>
-                <w:b/>
-                <w:bCs/>
-                <w:sz w:val="19"/>
-                <w:szCs w:val="19"/>
-              </w:rPr>
-              <w:t xml:space="preserve">Data allowed</w:t>
-            </w:r>
-          </w:p>
-        </w:tc>
-        <w:tc>
-          <w:tcPr>
-            <w:tcW w:type="dxa" w:w="1938"/>
-            <w:tcBorders>
-              <w:top w:val="single" w:color="C5CCD3" w:sz="4"/>
-              <w:left w:val="single" w:color="C5CCD3" w:sz="4"/>
-              <w:bottom w:val="single" w:color="C5CCD3" w:sz="4"/>
-              <w:right w:val="single" w:color="C5CCD3" w:sz="4"/>
-            </w:tcBorders>
-            <w:shd w:fill="E8F0FA" w:color="auto" w:val="clear"/>
-            <w:tcMar>
-              <w:top w:type="dxa" w:w="60"/>
-              <w:left w:type="dxa" w:w="100"/>
-              <w:bottom w:type="dxa" w:w="60"/>
-              <w:right w:type="dxa" w:w="100"/>
-            </w:tcMar>
-          </w:tcPr>
-          <w:p>
-            <w:r>
-              <w:rPr>
-                <w:b/>
-                <w:bCs/>
-                <w:sz w:val="19"/>
-                <w:szCs w:val="19"/>
-              </w:rPr>
-              <w:t xml:space="preserve">How configuration changes</w:t>
-            </w:r>
-          </w:p>
-        </w:tc>
-      </w:tr>
-      <w:tr>
-        <w:tc>
-          <w:tcPr>
-            <w:tcW w:type="dxa" w:w="1752"/>
-            <w:tcBorders>
-              <w:top w:val="single" w:color="C5CCD3" w:sz="4"/>
-              <w:left w:val="single" w:color="C5CCD3" w:sz="4"/>
-              <w:bottom w:val="single" w:color="C5CCD3" w:sz="4"/>
-              <w:right w:val="single" w:color="C5CCD3" w:sz="4"/>
-            </w:tcBorders>
-            <w:tcMar>
-              <w:top w:type="dxa" w:w="60"/>
-              <w:left w:type="dxa" w:w="100"/>
-              <w:bottom w:type="dxa" w:w="60"/>
-              <w:right w:type="dxa" w:w="100"/>
-            </w:tcMar>
-          </w:tcPr>
-          <w:p>
-            <w:r>
-              <w:rPr>
-                <w:b w:val="false"/>
-                <w:bCs w:val="false"/>
-                <w:sz w:val="19"/>
-                <w:szCs w:val="19"/>
-              </w:rPr>
-              <w:t xml:space="preserve">Development (dev)</w:t>
-            </w:r>
-          </w:p>
-        </w:tc>
-        <w:tc>
-          <w:tcPr>
-            <w:tcW w:type="dxa" w:w="1943"/>
-            <w:tcBorders>
-              <w:top w:val="single" w:color="C5CCD3" w:sz="4"/>
-              <w:left w:val="single" w:color="C5CCD3" w:sz="4"/>
-              <w:bottom w:val="single" w:color="C5CCD3" w:sz="4"/>
-              <w:right w:val="single" w:color="C5CCD3" w:sz="4"/>
-            </w:tcBorders>
-            <w:tcMar>
-              <w:top w:type="dxa" w:w="60"/>
-              <w:left w:type="dxa" w:w="100"/>
-              <w:bottom w:type="dxa" w:w="60"/>
-              <w:right w:type="dxa" w:w="100"/>
-            </w:tcMar>
-          </w:tcPr>
-          <w:p>
-            <w:r>
-              <w:rPr>
-                <w:b w:val="false"/>
-                <w:bCs w:val="false"/>
-                <w:sz w:val="19"/>
-                <w:szCs w:val="19"/>
-              </w:rPr>
-              <w:t xml:space="preserve">mft-dev.&lt;domain&gt;</w:t>
-            </w:r>
-          </w:p>
-        </w:tc>
-        <w:tc>
-          <w:tcPr>
-            <w:tcW w:type="dxa" w:w="2116"/>
-            <w:tcBorders>
-              <w:top w:val="single" w:color="C5CCD3" w:sz="4"/>
-              <w:left w:val="single" w:color="C5CCD3" w:sz="4"/>
-              <w:bottom w:val="single" w:color="C5CCD3" w:sz="4"/>
-              <w:right w:val="single" w:color="C5CCD3" w:sz="4"/>
-            </w:tcBorders>
-            <w:tcMar>
-              <w:top w:type="dxa" w:w="60"/>
-              <w:left w:type="dxa" w:w="100"/>
-              <w:bottom w:type="dxa" w:w="60"/>
-              <w:right w:type="dxa" w:w="100"/>
-            </w:tcMar>
-          </w:tcPr>
-          <w:p>
-            <w:r>
-              <w:rPr>
-                <w:b w:val="false"/>
-                <w:bCs w:val="false"/>
-                <w:sz w:val="19"/>
-                <w:szCs w:val="19"/>
-              </w:rPr>
-              <w:t xml:space="preserve">Build and unit test flows. Product teams self-serve.</w:t>
-            </w:r>
-          </w:p>
-        </w:tc>
-        <w:tc>
-          <w:tcPr>
-            <w:tcW w:type="dxa" w:w="1889"/>
-            <w:tcBorders>
-              <w:top w:val="single" w:color="C5CCD3" w:sz="4"/>
-              <w:left w:val="single" w:color="C5CCD3" w:sz="4"/>
-              <w:bottom w:val="single" w:color="C5CCD3" w:sz="4"/>
-              <w:right w:val="single" w:color="C5CCD3" w:sz="4"/>
-            </w:tcBorders>
-            <w:tcMar>
-              <w:top w:type="dxa" w:w="60"/>
-              <w:left w:type="dxa" w:w="100"/>
-              <w:bottom w:type="dxa" w:w="60"/>
-              <w:right w:type="dxa" w:w="100"/>
-            </w:tcMar>
-          </w:tcPr>
-          <w:p>
-            <w:r>
-              <w:rPr>
-                <w:b w:val="false"/>
-                <w:bCs w:val="false"/>
-                <w:sz w:val="19"/>
-                <w:szCs w:val="19"/>
-              </w:rPr>
-              <w:t xml:space="preserve">Synthetic only</w:t>
-            </w:r>
-          </w:p>
-        </w:tc>
-        <w:tc>
-          <w:tcPr>
-            <w:tcW w:type="dxa" w:w="1938"/>
-            <w:tcBorders>
-              <w:top w:val="single" w:color="C5CCD3" w:sz="4"/>
-              <w:left w:val="single" w:color="C5CCD3" w:sz="4"/>
-              <w:bottom w:val="single" w:color="C5CCD3" w:sz="4"/>
-              <w:right w:val="single" w:color="C5CCD3" w:sz="4"/>
-            </w:tcBorders>
-            <w:tcMar>
-              <w:top w:type="dxa" w:w="60"/>
-              <w:left w:type="dxa" w:w="100"/>
-              <w:bottom w:type="dxa" w:w="60"/>
-              <w:right w:type="dxa" w:w="100"/>
-            </w:tcMar>
-          </w:tcPr>
-          <w:p>
-            <w:r>
-              <w:rPr>
-                <w:b w:val="false"/>
-                <w:bCs w:val="false"/>
-                <w:sz w:val="19"/>
-                <w:szCs w:val="19"/>
-              </w:rPr>
-              <w:t xml:space="preserve">Built by the product team's Standard_Admin and Standard_User</w:t>
-            </w:r>
-          </w:p>
-        </w:tc>
-      </w:tr>
-      <w:tr>
-        <w:tc>
-          <w:tcPr>
-            <w:tcW w:type="dxa" w:w="1752"/>
-            <w:tcBorders>
-              <w:top w:val="single" w:color="C5CCD3" w:sz="4"/>
-              <w:left w:val="single" w:color="C5CCD3" w:sz="4"/>
-              <w:bottom w:val="single" w:color="C5CCD3" w:sz="4"/>
-              <w:right w:val="single" w:color="C5CCD3" w:sz="4"/>
-            </w:tcBorders>
-            <w:tcMar>
-              <w:top w:type="dxa" w:w="60"/>
-              <w:left w:type="dxa" w:w="100"/>
-              <w:bottom w:type="dxa" w:w="60"/>
-              <w:right w:type="dxa" w:w="100"/>
-            </w:tcMar>
-          </w:tcPr>
-          <w:p>
-            <w:r>
-              <w:rPr>
-                <w:b w:val="false"/>
-                <w:bCs w:val="false"/>
-                <w:sz w:val="19"/>
-                <w:szCs w:val="19"/>
-              </w:rPr>
-              <w:t xml:space="preserve">Test (test)</w:t>
-            </w:r>
-          </w:p>
-        </w:tc>
-        <w:tc>
-          <w:tcPr>
-            <w:tcW w:type="dxa" w:w="1943"/>
-            <w:tcBorders>
-              <w:top w:val="single" w:color="C5CCD3" w:sz="4"/>
-              <w:left w:val="single" w:color="C5CCD3" w:sz="4"/>
-              <w:bottom w:val="single" w:color="C5CCD3" w:sz="4"/>
-              <w:right w:val="single" w:color="C5CCD3" w:sz="4"/>
-            </w:tcBorders>
-            <w:tcMar>
-              <w:top w:type="dxa" w:w="60"/>
-              <w:left w:type="dxa" w:w="100"/>
-              <w:bottom w:type="dxa" w:w="60"/>
-              <w:right w:type="dxa" w:w="100"/>
-            </w:tcMar>
-          </w:tcPr>
-          <w:p>
-            <w:r>
-              <w:rPr>
-                <w:b w:val="false"/>
-                <w:bCs w:val="false"/>
-                <w:sz w:val="19"/>
-                <w:szCs w:val="19"/>
-              </w:rPr>
-              <w:t xml:space="preserve">mft-tst.&lt;domain&gt;</w:t>
-            </w:r>
-          </w:p>
-        </w:tc>
-        <w:tc>
-          <w:tcPr>
-            <w:tcW w:type="dxa" w:w="2116"/>
-            <w:tcBorders>
-              <w:top w:val="single" w:color="C5CCD3" w:sz="4"/>
-              <w:left w:val="single" w:color="C5CCD3" w:sz="4"/>
-              <w:bottom w:val="single" w:color="C5CCD3" w:sz="4"/>
-              <w:right w:val="single" w:color="C5CCD3" w:sz="4"/>
-            </w:tcBorders>
-            <w:tcMar>
-              <w:top w:type="dxa" w:w="60"/>
-              <w:left w:type="dxa" w:w="100"/>
-              <w:bottom w:type="dxa" w:w="60"/>
-              <w:right w:type="dxa" w:w="100"/>
-            </w:tcMar>
-          </w:tcPr>
-          <w:p>
-            <w:r>
-              <w:rPr>
-                <w:b w:val="false"/>
-                <w:bCs w:val="false"/>
-                <w:sz w:val="19"/>
-                <w:szCs w:val="19"/>
-              </w:rPr>
-              <w:t xml:space="preserve">System and integration testing, partner connectivity tests</w:t>
-            </w:r>
-          </w:p>
-        </w:tc>
-        <w:tc>
-          <w:tcPr>
-            <w:tcW w:type="dxa" w:w="1889"/>
-            <w:tcBorders>
-              <w:top w:val="single" w:color="C5CCD3" w:sz="4"/>
-              <w:left w:val="single" w:color="C5CCD3" w:sz="4"/>
-              <w:bottom w:val="single" w:color="C5CCD3" w:sz="4"/>
-              <w:right w:val="single" w:color="C5CCD3" w:sz="4"/>
-            </w:tcBorders>
-            <w:tcMar>
-              <w:top w:type="dxa" w:w="60"/>
-              <w:left w:type="dxa" w:w="100"/>
-              <w:bottom w:type="dxa" w:w="60"/>
-              <w:right w:type="dxa" w:w="100"/>
-            </w:tcMar>
-          </w:tcPr>
-          <w:p>
-            <w:r>
-              <w:rPr>
-                <w:b w:val="false"/>
-                <w:bCs w:val="false"/>
-                <w:sz w:val="19"/>
-                <w:szCs w:val="19"/>
-              </w:rPr>
-              <w:t xml:space="preserve">Synthetic or masked</w:t>
-            </w:r>
-          </w:p>
-        </w:tc>
-        <w:tc>
-          <w:tcPr>
-            <w:tcW w:type="dxa" w:w="1938"/>
-            <w:tcBorders>
-              <w:top w:val="single" w:color="C5CCD3" w:sz="4"/>
-              <w:left w:val="single" w:color="C5CCD3" w:sz="4"/>
-              <w:bottom w:val="single" w:color="C5CCD3" w:sz="4"/>
-              <w:right w:val="single" w:color="C5CCD3" w:sz="4"/>
-            </w:tcBorders>
-            <w:tcMar>
-              <w:top w:type="dxa" w:w="60"/>
-              <w:left w:type="dxa" w:w="100"/>
-              <w:bottom w:type="dxa" w:w="60"/>
-              <w:right w:type="dxa" w:w="100"/>
-            </w:tcMar>
-          </w:tcPr>
-          <w:p>
-            <w:r>
-              <w:rPr>
-                <w:b w:val="false"/>
-                <w:bCs w:val="false"/>
-                <w:sz w:val="19"/>
-                <w:szCs w:val="19"/>
-              </w:rPr>
-              <w:t xml:space="preserve">Promoted from dev; fixes are made in dev and promoted again</w:t>
-            </w:r>
-          </w:p>
-        </w:tc>
-      </w:tr>
-      <w:tr>
-        <w:tc>
-          <w:tcPr>
-            <w:tcW w:type="dxa" w:w="1752"/>
-            <w:tcBorders>
-              <w:top w:val="single" w:color="C5CCD3" w:sz="4"/>
-              <w:left w:val="single" w:color="C5CCD3" w:sz="4"/>
-              <w:bottom w:val="single" w:color="C5CCD3" w:sz="4"/>
-              <w:right w:val="single" w:color="C5CCD3" w:sz="4"/>
-            </w:tcBorders>
-            <w:tcMar>
-              <w:top w:type="dxa" w:w="60"/>
-              <w:left w:type="dxa" w:w="100"/>
-              <w:bottom w:type="dxa" w:w="60"/>
-              <w:right w:type="dxa" w:w="100"/>
-            </w:tcMar>
-          </w:tcPr>
-          <w:p>
-            <w:r>
-              <w:rPr>
-                <w:b w:val="false"/>
-                <w:bCs w:val="false"/>
-                <w:sz w:val="19"/>
-                <w:szCs w:val="19"/>
-              </w:rPr>
-              <w:t xml:space="preserve">Pre-production (pre-prod)</w:t>
-            </w:r>
-          </w:p>
-        </w:tc>
-        <w:tc>
-          <w:tcPr>
-            <w:tcW w:type="dxa" w:w="1943"/>
-            <w:tcBorders>
-              <w:top w:val="single" w:color="C5CCD3" w:sz="4"/>
-              <w:left w:val="single" w:color="C5CCD3" w:sz="4"/>
-              <w:bottom w:val="single" w:color="C5CCD3" w:sz="4"/>
-              <w:right w:val="single" w:color="C5CCD3" w:sz="4"/>
-            </w:tcBorders>
-            <w:tcMar>
-              <w:top w:type="dxa" w:w="60"/>
-              <w:left w:type="dxa" w:w="100"/>
-              <w:bottom w:type="dxa" w:w="60"/>
-              <w:right w:type="dxa" w:w="100"/>
-            </w:tcMar>
-          </w:tcPr>
-          <w:p>
-            <w:r>
-              <w:rPr>
-                <w:b w:val="false"/>
-                <w:bCs w:val="false"/>
-                <w:sz w:val="19"/>
-                <w:szCs w:val="19"/>
-              </w:rPr>
-              <w:t xml:space="preserve">mft-ppd.&lt;domain&gt;</w:t>
-            </w:r>
-          </w:p>
-        </w:tc>
-        <w:tc>
-          <w:tcPr>
-            <w:tcW w:type="dxa" w:w="2116"/>
-            <w:tcBorders>
-              <w:top w:val="single" w:color="C5CCD3" w:sz="4"/>
-              <w:left w:val="single" w:color="C5CCD3" w:sz="4"/>
-              <w:bottom w:val="single" w:color="C5CCD3" w:sz="4"/>
-              <w:right w:val="single" w:color="C5CCD3" w:sz="4"/>
-            </w:tcBorders>
-            <w:tcMar>
-              <w:top w:type="dxa" w:w="60"/>
-              <w:left w:type="dxa" w:w="100"/>
-              <w:bottom w:type="dxa" w:w="60"/>
-              <w:right w:type="dxa" w:w="100"/>
-            </w:tcMar>
-          </w:tcPr>
-          <w:p>
-            <w:r>
-              <w:rPr>
-                <w:b w:val="false"/>
-                <w:bCs w:val="false"/>
-                <w:sz w:val="19"/>
-                <w:szCs w:val="19"/>
-              </w:rPr>
-              <w:t xml:space="preserve">Production-like rehearsal: operational acceptance, release rehearsal, volume checks</w:t>
-            </w:r>
-          </w:p>
-        </w:tc>
-        <w:tc>
-          <w:tcPr>
-            <w:tcW w:type="dxa" w:w="1889"/>
-            <w:tcBorders>
-              <w:top w:val="single" w:color="C5CCD3" w:sz="4"/>
-              <w:left w:val="single" w:color="C5CCD3" w:sz="4"/>
-              <w:bottom w:val="single" w:color="C5CCD3" w:sz="4"/>
-              <w:right w:val="single" w:color="C5CCD3" w:sz="4"/>
-            </w:tcBorders>
-            <w:tcMar>
-              <w:top w:type="dxa" w:w="60"/>
-              <w:left w:type="dxa" w:w="100"/>
-              <w:bottom w:type="dxa" w:w="60"/>
-              <w:right w:type="dxa" w:w="100"/>
-            </w:tcMar>
-          </w:tcPr>
-          <w:p>
-            <w:r>
-              <w:rPr>
-                <w:b w:val="false"/>
-                <w:bCs w:val="false"/>
-                <w:sz w:val="19"/>
-                <w:szCs w:val="19"/>
-              </w:rPr>
-              <w:t xml:space="preserve">Masked or approved production-like data (D-ENV-04)</w:t>
-            </w:r>
-          </w:p>
-        </w:tc>
-        <w:tc>
-          <w:tcPr>
-            <w:tcW w:type="dxa" w:w="1938"/>
-            <w:tcBorders>
-              <w:top w:val="single" w:color="C5CCD3" w:sz="4"/>
-              <w:left w:val="single" w:color="C5CCD3" w:sz="4"/>
-              <w:bottom w:val="single" w:color="C5CCD3" w:sz="4"/>
-              <w:right w:val="single" w:color="C5CCD3" w:sz="4"/>
-            </w:tcBorders>
-            <w:tcMar>
-              <w:top w:type="dxa" w:w="60"/>
-              <w:left w:type="dxa" w:w="100"/>
-              <w:bottom w:type="dxa" w:w="60"/>
-              <w:right w:type="dxa" w:w="100"/>
-            </w:tcMar>
-          </w:tcPr>
-          <w:p>
-            <w:r>
-              <w:rPr>
-                <w:b w:val="false"/>
-                <w:bCs w:val="false"/>
-                <w:sz w:val="19"/>
-                <w:szCs w:val="19"/>
-              </w:rPr>
-              <w:t xml:space="preserve">Promotion only</w:t>
-            </w:r>
-          </w:p>
-        </w:tc>
-      </w:tr>
-      <w:tr>
-        <w:tc>
-          <w:tcPr>
-            <w:tcW w:type="dxa" w:w="1752"/>
-            <w:tcBorders>
-              <w:top w:val="single" w:color="C5CCD3" w:sz="4"/>
-              <w:left w:val="single" w:color="C5CCD3" w:sz="4"/>
-              <w:bottom w:val="single" w:color="C5CCD3" w:sz="4"/>
-              <w:right w:val="single" w:color="C5CCD3" w:sz="4"/>
-            </w:tcBorders>
-            <w:tcMar>
-              <w:top w:type="dxa" w:w="60"/>
-              <w:left w:type="dxa" w:w="100"/>
-              <w:bottom w:type="dxa" w:w="60"/>
-              <w:right w:type="dxa" w:w="100"/>
-            </w:tcMar>
-          </w:tcPr>
-          <w:p>
-            <w:r>
-              <w:rPr>
-                <w:b w:val="false"/>
-                <w:bCs w:val="false"/>
-                <w:sz w:val="19"/>
-                <w:szCs w:val="19"/>
-              </w:rPr>
-              <w:t xml:space="preserve">Production (prod)</w:t>
-            </w:r>
-          </w:p>
-        </w:tc>
-        <w:tc>
-          <w:tcPr>
-            <w:tcW w:type="dxa" w:w="1943"/>
-            <w:tcBorders>
-              <w:top w:val="single" w:color="C5CCD3" w:sz="4"/>
-              <w:left w:val="single" w:color="C5CCD3" w:sz="4"/>
-              <w:bottom w:val="single" w:color="C5CCD3" w:sz="4"/>
-              <w:right w:val="single" w:color="C5CCD3" w:sz="4"/>
-            </w:tcBorders>
-            <w:tcMar>
-              <w:top w:type="dxa" w:w="60"/>
-              <w:left w:type="dxa" w:w="100"/>
-              <w:bottom w:type="dxa" w:w="60"/>
-              <w:right w:type="dxa" w:w="100"/>
-            </w:tcMar>
-          </w:tcPr>
-          <w:p>
-            <w:r>
-              <w:rPr>
-                <w:b w:val="false"/>
-                <w:bCs w:val="false"/>
-                <w:sz w:val="19"/>
-                <w:szCs w:val="19"/>
-              </w:rPr>
-              <w:t xml:space="preserve">mft.&lt;domain&gt;</w:t>
-            </w:r>
-          </w:p>
-        </w:tc>
-        <w:tc>
-          <w:tcPr>
-            <w:tcW w:type="dxa" w:w="2116"/>
-            <w:tcBorders>
-              <w:top w:val="single" w:color="C5CCD3" w:sz="4"/>
-              <w:left w:val="single" w:color="C5CCD3" w:sz="4"/>
-              <w:bottom w:val="single" w:color="C5CCD3" w:sz="4"/>
-              <w:right w:val="single" w:color="C5CCD3" w:sz="4"/>
-            </w:tcBorders>
-            <w:tcMar>
-              <w:top w:type="dxa" w:w="60"/>
-              <w:left w:type="dxa" w:w="100"/>
-              <w:bottom w:type="dxa" w:w="60"/>
-              <w:right w:type="dxa" w:w="100"/>
-            </w:tcMar>
-          </w:tcPr>
-          <w:p>
-            <w:r>
-              <w:rPr>
-                <w:b w:val="false"/>
-                <w:bCs w:val="false"/>
-                <w:sz w:val="19"/>
-                <w:szCs w:val="19"/>
-              </w:rPr>
-              <w:t xml:space="preserve">Live transfers</w:t>
-            </w:r>
-          </w:p>
-        </w:tc>
-        <w:tc>
-          <w:tcPr>
-            <w:tcW w:type="dxa" w:w="1889"/>
-            <w:tcBorders>
-              <w:top w:val="single" w:color="C5CCD3" w:sz="4"/>
-              <w:left w:val="single" w:color="C5CCD3" w:sz="4"/>
-              <w:bottom w:val="single" w:color="C5CCD3" w:sz="4"/>
-              <w:right w:val="single" w:color="C5CCD3" w:sz="4"/>
-            </w:tcBorders>
-            <w:tcMar>
-              <w:top w:type="dxa" w:w="60"/>
-              <w:left w:type="dxa" w:w="100"/>
-              <w:bottom w:type="dxa" w:w="60"/>
-              <w:right w:type="dxa" w:w="100"/>
-            </w:tcMar>
-          </w:tcPr>
-          <w:p>
-            <w:r>
-              <w:rPr>
-                <w:b w:val="false"/>
-                <w:bCs w:val="false"/>
-                <w:sz w:val="19"/>
-                <w:szCs w:val="19"/>
-              </w:rPr>
-              <w:t xml:space="preserve">Live</w:t>
-            </w:r>
-          </w:p>
-        </w:tc>
-        <w:tc>
-          <w:tcPr>
-            <w:tcW w:type="dxa" w:w="1938"/>
-            <w:tcBorders>
-              <w:top w:val="single" w:color="C5CCD3" w:sz="4"/>
-              <w:left w:val="single" w:color="C5CCD3" w:sz="4"/>
-              <w:bottom w:val="single" w:color="C5CCD3" w:sz="4"/>
-              <w:right w:val="single" w:color="C5CCD3" w:sz="4"/>
-            </w:tcBorders>
-            <w:tcMar>
-              <w:top w:type="dxa" w:w="60"/>
-              <w:left w:type="dxa" w:w="100"/>
-              <w:bottom w:type="dxa" w:w="60"/>
-              <w:right w:type="dxa" w:w="100"/>
-            </w:tcMar>
-          </w:tcPr>
-          <w:p>
-            <w:r>
-              <w:rPr>
-                <w:b w:val="false"/>
-                <w:bCs w:val="false"/>
-                <w:sz w:val="19"/>
-                <w:szCs w:val="19"/>
-              </w:rPr>
-              <w:t xml:space="preserve">Promotion only, under change control</w:t>
-            </w:r>
-          </w:p>
-        </w:tc>
-      </w:tr>
-    </w:tbl>
-    <w:p>
-      <w:pPr>
-        <w:spacing w:after="60"/>
-      </w:pPr>
     </w:p>
     <w:p>
       <w:pPr>
-        <w:pBdr>
-          <w:left w:val="single" w:color="7A5A00" w:sz="24" w:space="6"/>
-        </w:pBdr>
-        <w:shd w:fill="FDF3D6" w:color="auto" w:val="clear"/>
-        <w:spacing w:after="160" w:before="80"/>
+        <w:pStyle w:val="ListParagraph"/>
+        <w:numPr>
+          <w:ilvl w:val="0"/>
+          <w:numId w:val="2"/>
+        </w:numPr>
       </w:pPr>
       <w:r>
-        <w:rPr>
-          <w:sz w:val="20"/>
-          <w:szCs w:val="20"/>
-        </w:rPr>
-        <w:t xml:space="preserve">Base URLs are a proposed pattern. Where vanity DNS names are already allocated, those names are used and this table is updated to match.</w:t>
+        <w:t xml:space="preserve">Base URL: Boomi provides a default address for each site. We publish a vanity name instead (a CNAME in our DNS that points to the Boomi host), so users, partners and runbooks use an address we control.</w:t>
+      </w:r>
+    </w:p>
+    <w:p>
+      <w:pPr>
+        <w:pStyle w:val="ListParagraph"/>
+        <w:numPr>
+          <w:ilvl w:val="0"/>
+          <w:numId w:val="2"/>
+        </w:numPr>
+      </w:pPr>
+      <w:r>
+        <w:t xml:space="preserve">Region: the site's region decides where Boomi runs the service and holds files in transit. The region for each of our sites is to be confirmed with Boomi (D-ENV-05).</w:t>
+      </w:r>
+    </w:p>
+    <w:p>
+      <w:pPr>
+        <w:pStyle w:val="ListParagraph"/>
+        <w:numPr>
+          <w:ilvl w:val="0"/>
+          <w:numId w:val="2"/>
+        </w:numPr>
+      </w:pPr>
+      <w:r>
+        <w:t xml:space="preserve">Network: partner allow-lists and our outbound firewall rules for MFT Nodes are set per site. A rule written for the dev site does not open access to the prod site.</w:t>
+      </w:r>
+    </w:p>
+    <w:p>
+      <w:pPr>
+        <w:pStyle w:val="ListParagraph"/>
+        <w:numPr>
+          <w:ilvl w:val="0"/>
+          <w:numId w:val="2"/>
+        </w:numPr>
+      </w:pPr>
+      <w:r>
+        <w:t xml:space="preserve">Shared, not mixed: instances on the same site share the base URL and the Boomi-managed infrastructure behind it, and nothing else.</w:t>
+      </w:r>
+    </w:p>
+    <w:p>
+      <w:pPr>
+        <w:pStyle w:val="ListParagraph"/>
+        <w:numPr>
+          <w:ilvl w:val="0"/>
+          <w:numId w:val="2"/>
+        </w:numPr>
+      </w:pPr>
+      <w:r>
+        <w:t xml:space="preserve">Settings: which settings sit at site level and which at instance level (for example sign-in and SSO, password policy, branding, IP restrictions) is to be confirmed with Boomi (D-ENV-06).</w:t>
+      </w:r>
+    </w:p>
+    <w:p>
+      <w:pPr>
+        <w:spacing w:after="120"/>
+      </w:pPr>
+      <w:r>
+        <w:t xml:space="preserve">On the programme each AFT environment is its own site with its own link: development, test, pre-production and production. A change made on the development site cannot affect the other three.</w:t>
       </w:r>
     </w:p>
     <w:p>
@@ -7000,7 +5850,179 @@
         <w:pStyle w:val="Heading2"/>
       </w:pPr>
       <w:r>
-        <w:t xml:space="preserve">6.3 Instances</w:t>
+        <w:t xml:space="preserve">6.2 Instance</w:t>
+      </w:r>
+    </w:p>
+    <w:p>
+      <w:pPr>
+        <w:spacing w:after="120"/>
+      </w:pPr>
+      <w:r>
+        <w:t xml:space="preserve">An instance is a logically isolated tenant inside a site. It cannot see or touch another instance's data, configuration or users, even when both instances sit on the same site and share its base URL.</w:t>
+      </w:r>
+    </w:p>
+    <w:p>
+      <w:pPr>
+        <w:spacing w:after="120"/>
+      </w:pPr>
+      <w:r>
+        <w:t xml:space="preserve">Each instance holds its own:</w:t>
+      </w:r>
+    </w:p>
+    <w:p>
+      <w:pPr>
+        <w:pStyle w:val="ListParagraph"/>
+        <w:numPr>
+          <w:ilvl w:val="0"/>
+          <w:numId w:val="2"/>
+        </w:numPr>
+      </w:pPr>
+      <w:r>
+        <w:t xml:space="preserve">organizations, and the endpoints, flows, users and machine users inside them</w:t>
+      </w:r>
+    </w:p>
+    <w:p>
+      <w:pPr>
+        <w:pStyle w:val="ListParagraph"/>
+        <w:numPr>
+          <w:ilvl w:val="0"/>
+          <w:numId w:val="2"/>
+        </w:numPr>
+      </w:pPr>
+      <w:r>
+        <w:t xml:space="preserve">PGP and SSH keys and certificates</w:t>
+      </w:r>
+    </w:p>
+    <w:p>
+      <w:pPr>
+        <w:pStyle w:val="ListParagraph"/>
+        <w:numPr>
+          <w:ilvl w:val="0"/>
+          <w:numId w:val="2"/>
+        </w:numPr>
+      </w:pPr>
+      <w:r>
+        <w:t xml:space="preserve">MFT Nodes, each set up to connect to one instance (to confirm with Boomi, D-ENV-02)</w:t>
+      </w:r>
+    </w:p>
+    <w:p>
+      <w:pPr>
+        <w:pStyle w:val="ListParagraph"/>
+        <w:numPr>
+          <w:ilvl w:val="0"/>
+          <w:numId w:val="2"/>
+        </w:numPr>
+      </w:pPr>
+      <w:r>
+        <w:t xml:space="preserve">activity history, alerts and audit records</w:t>
+      </w:r>
+    </w:p>
+    <w:p>
+      <w:pPr>
+        <w:pStyle w:val="ListParagraph"/>
+        <w:numPr>
+          <w:ilvl w:val="0"/>
+          <w:numId w:val="2"/>
+        </w:numPr>
+      </w:pPr>
+      <w:r>
+        <w:t xml:space="preserve">administrators, who manage only that instance</w:t>
+      </w:r>
+    </w:p>
+    <w:p>
+      <w:pPr>
+        <w:spacing w:after="120"/>
+      </w:pPr>
+      <w:r>
+        <w:t xml:space="preserve">What isolation means in practice:</w:t>
+      </w:r>
+    </w:p>
+    <w:p>
+      <w:pPr>
+        <w:pStyle w:val="ListParagraph"/>
+        <w:numPr>
+          <w:ilvl w:val="0"/>
+          <w:numId w:val="2"/>
+        </w:numPr>
+      </w:pPr>
+      <w:r>
+        <w:t xml:space="preserve">A flow can only use endpoints of organizations in the same instance. A transfer between business areas in different instances needs a location both can reach and a flow in each instance (D-ENV-01).</w:t>
+      </w:r>
+    </w:p>
+    <w:p>
+      <w:pPr>
+        <w:pStyle w:val="ListParagraph"/>
+        <w:numPr>
+          <w:ilvl w:val="0"/>
+          <w:numId w:val="2"/>
+        </w:numPr>
+      </w:pPr>
+      <w:r>
+        <w:t xml:space="preserve">Endpoints and keys are not shared across instances. A partner that exchanges files with two business areas is set up in each instance.</w:t>
+      </w:r>
+    </w:p>
+    <w:p>
+      <w:pPr>
+        <w:pStyle w:val="ListParagraph"/>
+        <w:numPr>
+          <w:ilvl w:val="0"/>
+          <w:numId w:val="2"/>
+        </w:numPr>
+      </w:pPr>
+      <w:r>
+        <w:t xml:space="preserve">User access is granted per instance. A person working in two business areas needs access in both.</w:t>
+      </w:r>
+    </w:p>
+    <w:p>
+      <w:pPr>
+        <w:pStyle w:val="ListParagraph"/>
+        <w:numPr>
+          <w:ilvl w:val="0"/>
+          <w:numId w:val="2"/>
+        </w:numPr>
+      </w:pPr>
+      <w:r>
+        <w:t xml:space="preserve">Each instance needs its own MFT Nodes in every environment where it reaches internal endpoints (D-ENV-02).</w:t>
+      </w:r>
+    </w:p>
+    <w:p>
+      <w:pPr>
+        <w:pStyle w:val="ListParagraph"/>
+        <w:numPr>
+          <w:ilvl w:val="0"/>
+          <w:numId w:val="2"/>
+        </w:numPr>
+      </w:pPr>
+      <w:r>
+        <w:t xml:space="preserve">An incident, misconfiguration or compromised account in one instance cannot reach the files or settings of another.</w:t>
+      </w:r>
+    </w:p>
+    <w:p>
+      <w:pPr>
+        <w:pStyle w:val="ListParagraph"/>
+        <w:numPr>
+          <w:ilvl w:val="0"/>
+          <w:numId w:val="2"/>
+        </w:numPr>
+      </w:pPr>
+      <w:r>
+        <w:t xml:space="preserve">Reporting and audit are per instance, so each business area can evidence its own transfers.</w:t>
+      </w:r>
+    </w:p>
+    <w:p>
+      <w:pPr>
+        <w:pStyle w:val="Heading2"/>
+      </w:pPr>
+      <w:r>
+        <w:t xml:space="preserve">6.3 Our instances</w:t>
+      </w:r>
+    </w:p>
+    <w:p>
+      <w:pPr>
+        <w:spacing w:after="120"/>
+      </w:pPr>
+      <w:r>
+        <w:t xml:space="preserve">We have three instances, one per business area. The same three instances exist on every site.</w:t>
       </w:r>
     </w:p>
     <w:tbl>
@@ -7223,7 +6245,7 @@
                 <w:sz w:val="19"/>
                 <w:szCs w:val="19"/>
               </w:rPr>
-              <w:t xml:space="preserve">Borders and Trade</w:t>
+              <w:t xml:space="preserve">Valuation Office</w:t>
             </w:r>
           </w:p>
         </w:tc>
@@ -7251,7 +6273,7 @@
                 <w:sz w:val="19"/>
                 <w:szCs w:val="19"/>
               </w:rPr>
-              <w:t xml:space="preserve">BDT</w:t>
+              <w:t xml:space="preserve">VOA</w:t>
             </w:r>
           </w:p>
         </w:tc>
@@ -7279,7 +6301,7 @@
                 <w:sz w:val="19"/>
                 <w:szCs w:val="19"/>
               </w:rPr>
-              <w:t xml:space="preserve">File transfers for customs, borders and trade services, their product teams and partners</w:t>
+              <w:t xml:space="preserve">File transfers for property valuation services, their product teams and partners</w:t>
             </w:r>
           </w:p>
         </w:tc>
@@ -7309,7 +6331,7 @@
                 <w:sz w:val="19"/>
                 <w:szCs w:val="19"/>
               </w:rPr>
-              <w:t xml:space="preserve">Valuation Office</w:t>
+              <w:t xml:space="preserve">Borders and Trade</w:t>
             </w:r>
           </w:p>
         </w:tc>
@@ -7337,7 +6359,7 @@
                 <w:sz w:val="19"/>
                 <w:szCs w:val="19"/>
               </w:rPr>
-              <w:t xml:space="preserve">VOA</w:t>
+              <w:t xml:space="preserve">BDT</w:t>
             </w:r>
           </w:p>
         </w:tc>
@@ -7365,7 +6387,7 @@
                 <w:sz w:val="19"/>
                 <w:szCs w:val="19"/>
               </w:rPr>
-              <w:t xml:space="preserve">File transfers for property valuation services, their product teams and partners</w:t>
+              <w:t xml:space="preserve">File transfers for customs, borders and trade services, their product teams and partners</w:t>
             </w:r>
           </w:p>
         </w:tc>
@@ -7381,7 +6403,1249 @@
         <w:pStyle w:val="Heading2"/>
       </w:pPr>
       <w:r>
-        <w:t xml:space="preserve">6.4 Rules</w:t>
+        <w:t xml:space="preserve">6.4 Environments</w:t>
+      </w:r>
+    </w:p>
+    <w:p>
+      <w:pPr>
+        <w:spacing w:after="120"/>
+      </w:pPr>
+      <w:r>
+        <w:t xml:space="preserve">There are four environments for AFT. Each is a separate site hosting the three instances, which gives 12 instances in total. Tax in development and Tax in production are separate instances that share nothing; configuration moves between them only by promotion.</w:t>
+      </w:r>
+    </w:p>
+    <w:tbl>
+      <w:tblPr>
+        <w:tblW w:type="dxa" w:w="9638"/>
+        <w:tblBorders>
+          <w:top w:val="single" w:color="auto" w:sz="4"/>
+          <w:left w:val="single" w:color="auto" w:sz="4"/>
+          <w:bottom w:val="single" w:color="auto" w:sz="4"/>
+          <w:right w:val="single" w:color="auto" w:sz="4"/>
+          <w:insideH w:val="single" w:color="auto" w:sz="4"/>
+          <w:insideV w:val="single" w:color="auto" w:sz="4"/>
+        </w:tblBorders>
+      </w:tblPr>
+      <w:tblGrid>
+        <w:gridCol w:w="1710"/>
+        <w:gridCol w:w="1943"/>
+        <w:gridCol w:w="2121"/>
+        <w:gridCol w:w="1890"/>
+        <w:gridCol w:w="1974"/>
+      </w:tblGrid>
+      <w:tr>
+        <w:trPr>
+          <w:tblHeader/>
+        </w:trPr>
+        <w:tc>
+          <w:tcPr>
+            <w:tcW w:type="dxa" w:w="1710"/>
+            <w:tcBorders>
+              <w:top w:val="single" w:color="C5CCD3" w:sz="4"/>
+              <w:left w:val="single" w:color="C5CCD3" w:sz="4"/>
+              <w:bottom w:val="single" w:color="C5CCD3" w:sz="4"/>
+              <w:right w:val="single" w:color="C5CCD3" w:sz="4"/>
+            </w:tcBorders>
+            <w:shd w:fill="E8F0FA" w:color="auto" w:val="clear"/>
+            <w:tcMar>
+              <w:top w:type="dxa" w:w="60"/>
+              <w:left w:type="dxa" w:w="100"/>
+              <w:bottom w:type="dxa" w:w="60"/>
+              <w:right w:type="dxa" w:w="100"/>
+            </w:tcMar>
+          </w:tcPr>
+          <w:p>
+            <w:r>
+              <w:rPr>
+                <w:b/>
+                <w:bCs/>
+                <w:sz w:val="19"/>
+                <w:szCs w:val="19"/>
+              </w:rPr>
+              <w:t xml:space="preserve">Environment</w:t>
+            </w:r>
+          </w:p>
+        </w:tc>
+        <w:tc>
+          <w:tcPr>
+            <w:tcW w:type="dxa" w:w="1943"/>
+            <w:tcBorders>
+              <w:top w:val="single" w:color="C5CCD3" w:sz="4"/>
+              <w:left w:val="single" w:color="C5CCD3" w:sz="4"/>
+              <w:bottom w:val="single" w:color="C5CCD3" w:sz="4"/>
+              <w:right w:val="single" w:color="C5CCD3" w:sz="4"/>
+            </w:tcBorders>
+            <w:shd w:fill="E8F0FA" w:color="auto" w:val="clear"/>
+            <w:tcMar>
+              <w:top w:type="dxa" w:w="60"/>
+              <w:left w:type="dxa" w:w="100"/>
+              <w:bottom w:type="dxa" w:w="60"/>
+              <w:right w:type="dxa" w:w="100"/>
+            </w:tcMar>
+          </w:tcPr>
+          <w:p>
+            <w:r>
+              <w:rPr>
+                <w:b/>
+                <w:bCs/>
+                <w:sz w:val="19"/>
+                <w:szCs w:val="19"/>
+              </w:rPr>
+              <w:t xml:space="preserve">Site base URL (proposed)</w:t>
+            </w:r>
+          </w:p>
+        </w:tc>
+        <w:tc>
+          <w:tcPr>
+            <w:tcW w:type="dxa" w:w="2121"/>
+            <w:tcBorders>
+              <w:top w:val="single" w:color="C5CCD3" w:sz="4"/>
+              <w:left w:val="single" w:color="C5CCD3" w:sz="4"/>
+              <w:bottom w:val="single" w:color="C5CCD3" w:sz="4"/>
+              <w:right w:val="single" w:color="C5CCD3" w:sz="4"/>
+            </w:tcBorders>
+            <w:shd w:fill="E8F0FA" w:color="auto" w:val="clear"/>
+            <w:tcMar>
+              <w:top w:type="dxa" w:w="60"/>
+              <w:left w:type="dxa" w:w="100"/>
+              <w:bottom w:type="dxa" w:w="60"/>
+              <w:right w:type="dxa" w:w="100"/>
+            </w:tcMar>
+          </w:tcPr>
+          <w:p>
+            <w:r>
+              <w:rPr>
+                <w:b/>
+                <w:bCs/>
+                <w:sz w:val="19"/>
+                <w:szCs w:val="19"/>
+              </w:rPr>
+              <w:t xml:space="preserve">Purpose</w:t>
+            </w:r>
+          </w:p>
+        </w:tc>
+        <w:tc>
+          <w:tcPr>
+            <w:tcW w:type="dxa" w:w="1890"/>
+            <w:tcBorders>
+              <w:top w:val="single" w:color="C5CCD3" w:sz="4"/>
+              <w:left w:val="single" w:color="C5CCD3" w:sz="4"/>
+              <w:bottom w:val="single" w:color="C5CCD3" w:sz="4"/>
+              <w:right w:val="single" w:color="C5CCD3" w:sz="4"/>
+            </w:tcBorders>
+            <w:shd w:fill="E8F0FA" w:color="auto" w:val="clear"/>
+            <w:tcMar>
+              <w:top w:type="dxa" w:w="60"/>
+              <w:left w:type="dxa" w:w="100"/>
+              <w:bottom w:type="dxa" w:w="60"/>
+              <w:right w:type="dxa" w:w="100"/>
+            </w:tcMar>
+          </w:tcPr>
+          <w:p>
+            <w:r>
+              <w:rPr>
+                <w:b/>
+                <w:bCs/>
+                <w:sz w:val="19"/>
+                <w:szCs w:val="19"/>
+              </w:rPr>
+              <w:t xml:space="preserve">Data allowed</w:t>
+            </w:r>
+          </w:p>
+        </w:tc>
+        <w:tc>
+          <w:tcPr>
+            <w:tcW w:type="dxa" w:w="1974"/>
+            <w:tcBorders>
+              <w:top w:val="single" w:color="C5CCD3" w:sz="4"/>
+              <w:left w:val="single" w:color="C5CCD3" w:sz="4"/>
+              <w:bottom w:val="single" w:color="C5CCD3" w:sz="4"/>
+              <w:right w:val="single" w:color="C5CCD3" w:sz="4"/>
+            </w:tcBorders>
+            <w:shd w:fill="E8F0FA" w:color="auto" w:val="clear"/>
+            <w:tcMar>
+              <w:top w:type="dxa" w:w="60"/>
+              <w:left w:type="dxa" w:w="100"/>
+              <w:bottom w:type="dxa" w:w="60"/>
+              <w:right w:type="dxa" w:w="100"/>
+            </w:tcMar>
+          </w:tcPr>
+          <w:p>
+            <w:r>
+              <w:rPr>
+                <w:b/>
+                <w:bCs/>
+                <w:sz w:val="19"/>
+                <w:szCs w:val="19"/>
+              </w:rPr>
+              <w:t xml:space="preserve">How configuration changes</w:t>
+            </w:r>
+          </w:p>
+        </w:tc>
+      </w:tr>
+      <w:tr>
+        <w:tc>
+          <w:tcPr>
+            <w:tcW w:type="dxa" w:w="1710"/>
+            <w:tcBorders>
+              <w:top w:val="single" w:color="C5CCD3" w:sz="4"/>
+              <w:left w:val="single" w:color="C5CCD3" w:sz="4"/>
+              <w:bottom w:val="single" w:color="C5CCD3" w:sz="4"/>
+              <w:right w:val="single" w:color="C5CCD3" w:sz="4"/>
+            </w:tcBorders>
+            <w:tcMar>
+              <w:top w:type="dxa" w:w="60"/>
+              <w:left w:type="dxa" w:w="100"/>
+              <w:bottom w:type="dxa" w:w="60"/>
+              <w:right w:type="dxa" w:w="100"/>
+            </w:tcMar>
+          </w:tcPr>
+          <w:p>
+            <w:r>
+              <w:rPr>
+                <w:b w:val="false"/>
+                <w:bCs w:val="false"/>
+                <w:sz w:val="19"/>
+                <w:szCs w:val="19"/>
+              </w:rPr>
+              <w:t xml:space="preserve">Development</w:t>
+            </w:r>
+          </w:p>
+        </w:tc>
+        <w:tc>
+          <w:tcPr>
+            <w:tcW w:type="dxa" w:w="1943"/>
+            <w:tcBorders>
+              <w:top w:val="single" w:color="C5CCD3" w:sz="4"/>
+              <w:left w:val="single" w:color="C5CCD3" w:sz="4"/>
+              <w:bottom w:val="single" w:color="C5CCD3" w:sz="4"/>
+              <w:right w:val="single" w:color="C5CCD3" w:sz="4"/>
+            </w:tcBorders>
+            <w:tcMar>
+              <w:top w:type="dxa" w:w="60"/>
+              <w:left w:type="dxa" w:w="100"/>
+              <w:bottom w:type="dxa" w:w="60"/>
+              <w:right w:type="dxa" w:w="100"/>
+            </w:tcMar>
+          </w:tcPr>
+          <w:p>
+            <w:r>
+              <w:rPr>
+                <w:b w:val="false"/>
+                <w:bCs w:val="false"/>
+                <w:sz w:val="19"/>
+                <w:szCs w:val="19"/>
+              </w:rPr>
+              <w:t xml:space="preserve">mft-dev.&lt;domain&gt;</w:t>
+            </w:r>
+          </w:p>
+        </w:tc>
+        <w:tc>
+          <w:tcPr>
+            <w:tcW w:type="dxa" w:w="2121"/>
+            <w:tcBorders>
+              <w:top w:val="single" w:color="C5CCD3" w:sz="4"/>
+              <w:left w:val="single" w:color="C5CCD3" w:sz="4"/>
+              <w:bottom w:val="single" w:color="C5CCD3" w:sz="4"/>
+              <w:right w:val="single" w:color="C5CCD3" w:sz="4"/>
+            </w:tcBorders>
+            <w:tcMar>
+              <w:top w:type="dxa" w:w="60"/>
+              <w:left w:type="dxa" w:w="100"/>
+              <w:bottom w:type="dxa" w:w="60"/>
+              <w:right w:type="dxa" w:w="100"/>
+            </w:tcMar>
+          </w:tcPr>
+          <w:p>
+            <w:r>
+              <w:rPr>
+                <w:b w:val="false"/>
+                <w:bCs w:val="false"/>
+                <w:sz w:val="19"/>
+                <w:szCs w:val="19"/>
+              </w:rPr>
+              <w:t xml:space="preserve">Build and unit test flows. Product teams self-serve.</w:t>
+            </w:r>
+          </w:p>
+        </w:tc>
+        <w:tc>
+          <w:tcPr>
+            <w:tcW w:type="dxa" w:w="1890"/>
+            <w:tcBorders>
+              <w:top w:val="single" w:color="C5CCD3" w:sz="4"/>
+              <w:left w:val="single" w:color="C5CCD3" w:sz="4"/>
+              <w:bottom w:val="single" w:color="C5CCD3" w:sz="4"/>
+              <w:right w:val="single" w:color="C5CCD3" w:sz="4"/>
+            </w:tcBorders>
+            <w:tcMar>
+              <w:top w:type="dxa" w:w="60"/>
+              <w:left w:type="dxa" w:w="100"/>
+              <w:bottom w:type="dxa" w:w="60"/>
+              <w:right w:type="dxa" w:w="100"/>
+            </w:tcMar>
+          </w:tcPr>
+          <w:p>
+            <w:r>
+              <w:rPr>
+                <w:b w:val="false"/>
+                <w:bCs w:val="false"/>
+                <w:sz w:val="19"/>
+                <w:szCs w:val="19"/>
+              </w:rPr>
+              <w:t xml:space="preserve">Synthetic only</w:t>
+            </w:r>
+          </w:p>
+        </w:tc>
+        <w:tc>
+          <w:tcPr>
+            <w:tcW w:type="dxa" w:w="1974"/>
+            <w:tcBorders>
+              <w:top w:val="single" w:color="C5CCD3" w:sz="4"/>
+              <w:left w:val="single" w:color="C5CCD3" w:sz="4"/>
+              <w:bottom w:val="single" w:color="C5CCD3" w:sz="4"/>
+              <w:right w:val="single" w:color="C5CCD3" w:sz="4"/>
+            </w:tcBorders>
+            <w:tcMar>
+              <w:top w:type="dxa" w:w="60"/>
+              <w:left w:type="dxa" w:w="100"/>
+              <w:bottom w:type="dxa" w:w="60"/>
+              <w:right w:type="dxa" w:w="100"/>
+            </w:tcMar>
+          </w:tcPr>
+          <w:p>
+            <w:r>
+              <w:rPr>
+                <w:b w:val="false"/>
+                <w:bCs w:val="false"/>
+                <w:sz w:val="19"/>
+                <w:szCs w:val="19"/>
+              </w:rPr>
+              <w:t xml:space="preserve">Built by the product team's Standard_Admin and Standard_User</w:t>
+            </w:r>
+          </w:p>
+        </w:tc>
+      </w:tr>
+      <w:tr>
+        <w:tc>
+          <w:tcPr>
+            <w:tcW w:type="dxa" w:w="1710"/>
+            <w:tcBorders>
+              <w:top w:val="single" w:color="C5CCD3" w:sz="4"/>
+              <w:left w:val="single" w:color="C5CCD3" w:sz="4"/>
+              <w:bottom w:val="single" w:color="C5CCD3" w:sz="4"/>
+              <w:right w:val="single" w:color="C5CCD3" w:sz="4"/>
+            </w:tcBorders>
+            <w:tcMar>
+              <w:top w:type="dxa" w:w="60"/>
+              <w:left w:type="dxa" w:w="100"/>
+              <w:bottom w:type="dxa" w:w="60"/>
+              <w:right w:type="dxa" w:w="100"/>
+            </w:tcMar>
+          </w:tcPr>
+          <w:p>
+            <w:r>
+              <w:rPr>
+                <w:b w:val="false"/>
+                <w:bCs w:val="false"/>
+                <w:sz w:val="19"/>
+                <w:szCs w:val="19"/>
+              </w:rPr>
+              <w:t xml:space="preserve">Test</w:t>
+            </w:r>
+          </w:p>
+        </w:tc>
+        <w:tc>
+          <w:tcPr>
+            <w:tcW w:type="dxa" w:w="1943"/>
+            <w:tcBorders>
+              <w:top w:val="single" w:color="C5CCD3" w:sz="4"/>
+              <w:left w:val="single" w:color="C5CCD3" w:sz="4"/>
+              <w:bottom w:val="single" w:color="C5CCD3" w:sz="4"/>
+              <w:right w:val="single" w:color="C5CCD3" w:sz="4"/>
+            </w:tcBorders>
+            <w:tcMar>
+              <w:top w:type="dxa" w:w="60"/>
+              <w:left w:type="dxa" w:w="100"/>
+              <w:bottom w:type="dxa" w:w="60"/>
+              <w:right w:type="dxa" w:w="100"/>
+            </w:tcMar>
+          </w:tcPr>
+          <w:p>
+            <w:r>
+              <w:rPr>
+                <w:b w:val="false"/>
+                <w:bCs w:val="false"/>
+                <w:sz w:val="19"/>
+                <w:szCs w:val="19"/>
+              </w:rPr>
+              <w:t xml:space="preserve">mft-tst.&lt;domain&gt;</w:t>
+            </w:r>
+          </w:p>
+        </w:tc>
+        <w:tc>
+          <w:tcPr>
+            <w:tcW w:type="dxa" w:w="2121"/>
+            <w:tcBorders>
+              <w:top w:val="single" w:color="C5CCD3" w:sz="4"/>
+              <w:left w:val="single" w:color="C5CCD3" w:sz="4"/>
+              <w:bottom w:val="single" w:color="C5CCD3" w:sz="4"/>
+              <w:right w:val="single" w:color="C5CCD3" w:sz="4"/>
+            </w:tcBorders>
+            <w:tcMar>
+              <w:top w:type="dxa" w:w="60"/>
+              <w:left w:type="dxa" w:w="100"/>
+              <w:bottom w:type="dxa" w:w="60"/>
+              <w:right w:type="dxa" w:w="100"/>
+            </w:tcMar>
+          </w:tcPr>
+          <w:p>
+            <w:r>
+              <w:rPr>
+                <w:b w:val="false"/>
+                <w:bCs w:val="false"/>
+                <w:sz w:val="19"/>
+                <w:szCs w:val="19"/>
+              </w:rPr>
+              <w:t xml:space="preserve">System and integration testing, partner connectivity tests</w:t>
+            </w:r>
+          </w:p>
+        </w:tc>
+        <w:tc>
+          <w:tcPr>
+            <w:tcW w:type="dxa" w:w="1890"/>
+            <w:tcBorders>
+              <w:top w:val="single" w:color="C5CCD3" w:sz="4"/>
+              <w:left w:val="single" w:color="C5CCD3" w:sz="4"/>
+              <w:bottom w:val="single" w:color="C5CCD3" w:sz="4"/>
+              <w:right w:val="single" w:color="C5CCD3" w:sz="4"/>
+            </w:tcBorders>
+            <w:tcMar>
+              <w:top w:type="dxa" w:w="60"/>
+              <w:left w:type="dxa" w:w="100"/>
+              <w:bottom w:type="dxa" w:w="60"/>
+              <w:right w:type="dxa" w:w="100"/>
+            </w:tcMar>
+          </w:tcPr>
+          <w:p>
+            <w:r>
+              <w:rPr>
+                <w:b w:val="false"/>
+                <w:bCs w:val="false"/>
+                <w:sz w:val="19"/>
+                <w:szCs w:val="19"/>
+              </w:rPr>
+              <w:t xml:space="preserve">Synthetic or masked</w:t>
+            </w:r>
+          </w:p>
+        </w:tc>
+        <w:tc>
+          <w:tcPr>
+            <w:tcW w:type="dxa" w:w="1974"/>
+            <w:tcBorders>
+              <w:top w:val="single" w:color="C5CCD3" w:sz="4"/>
+              <w:left w:val="single" w:color="C5CCD3" w:sz="4"/>
+              <w:bottom w:val="single" w:color="C5CCD3" w:sz="4"/>
+              <w:right w:val="single" w:color="C5CCD3" w:sz="4"/>
+            </w:tcBorders>
+            <w:tcMar>
+              <w:top w:type="dxa" w:w="60"/>
+              <w:left w:type="dxa" w:w="100"/>
+              <w:bottom w:type="dxa" w:w="60"/>
+              <w:right w:type="dxa" w:w="100"/>
+            </w:tcMar>
+          </w:tcPr>
+          <w:p>
+            <w:r>
+              <w:rPr>
+                <w:b w:val="false"/>
+                <w:bCs w:val="false"/>
+                <w:sz w:val="19"/>
+                <w:szCs w:val="19"/>
+              </w:rPr>
+              <w:t xml:space="preserve">Promoted from development; fixes are made in development and promoted again</w:t>
+            </w:r>
+          </w:p>
+        </w:tc>
+      </w:tr>
+      <w:tr>
+        <w:tc>
+          <w:tcPr>
+            <w:tcW w:type="dxa" w:w="1710"/>
+            <w:tcBorders>
+              <w:top w:val="single" w:color="C5CCD3" w:sz="4"/>
+              <w:left w:val="single" w:color="C5CCD3" w:sz="4"/>
+              <w:bottom w:val="single" w:color="C5CCD3" w:sz="4"/>
+              <w:right w:val="single" w:color="C5CCD3" w:sz="4"/>
+            </w:tcBorders>
+            <w:tcMar>
+              <w:top w:type="dxa" w:w="60"/>
+              <w:left w:type="dxa" w:w="100"/>
+              <w:bottom w:type="dxa" w:w="60"/>
+              <w:right w:type="dxa" w:w="100"/>
+            </w:tcMar>
+          </w:tcPr>
+          <w:p>
+            <w:r>
+              <w:rPr>
+                <w:b w:val="false"/>
+                <w:bCs w:val="false"/>
+                <w:sz w:val="19"/>
+                <w:szCs w:val="19"/>
+              </w:rPr>
+              <w:t xml:space="preserve">Pre-production</w:t>
+            </w:r>
+          </w:p>
+        </w:tc>
+        <w:tc>
+          <w:tcPr>
+            <w:tcW w:type="dxa" w:w="1943"/>
+            <w:tcBorders>
+              <w:top w:val="single" w:color="C5CCD3" w:sz="4"/>
+              <w:left w:val="single" w:color="C5CCD3" w:sz="4"/>
+              <w:bottom w:val="single" w:color="C5CCD3" w:sz="4"/>
+              <w:right w:val="single" w:color="C5CCD3" w:sz="4"/>
+            </w:tcBorders>
+            <w:tcMar>
+              <w:top w:type="dxa" w:w="60"/>
+              <w:left w:type="dxa" w:w="100"/>
+              <w:bottom w:type="dxa" w:w="60"/>
+              <w:right w:type="dxa" w:w="100"/>
+            </w:tcMar>
+          </w:tcPr>
+          <w:p>
+            <w:r>
+              <w:rPr>
+                <w:b w:val="false"/>
+                <w:bCs w:val="false"/>
+                <w:sz w:val="19"/>
+                <w:szCs w:val="19"/>
+              </w:rPr>
+              <w:t xml:space="preserve">mft-ppd.&lt;domain&gt;</w:t>
+            </w:r>
+          </w:p>
+        </w:tc>
+        <w:tc>
+          <w:tcPr>
+            <w:tcW w:type="dxa" w:w="2121"/>
+            <w:tcBorders>
+              <w:top w:val="single" w:color="C5CCD3" w:sz="4"/>
+              <w:left w:val="single" w:color="C5CCD3" w:sz="4"/>
+              <w:bottom w:val="single" w:color="C5CCD3" w:sz="4"/>
+              <w:right w:val="single" w:color="C5CCD3" w:sz="4"/>
+            </w:tcBorders>
+            <w:tcMar>
+              <w:top w:type="dxa" w:w="60"/>
+              <w:left w:type="dxa" w:w="100"/>
+              <w:bottom w:type="dxa" w:w="60"/>
+              <w:right w:type="dxa" w:w="100"/>
+            </w:tcMar>
+          </w:tcPr>
+          <w:p>
+            <w:r>
+              <w:rPr>
+                <w:b w:val="false"/>
+                <w:bCs w:val="false"/>
+                <w:sz w:val="19"/>
+                <w:szCs w:val="19"/>
+              </w:rPr>
+              <w:t xml:space="preserve">Production-like rehearsal: operational acceptance, release rehearsal, volume checks</w:t>
+            </w:r>
+          </w:p>
+        </w:tc>
+        <w:tc>
+          <w:tcPr>
+            <w:tcW w:type="dxa" w:w="1890"/>
+            <w:tcBorders>
+              <w:top w:val="single" w:color="C5CCD3" w:sz="4"/>
+              <w:left w:val="single" w:color="C5CCD3" w:sz="4"/>
+              <w:bottom w:val="single" w:color="C5CCD3" w:sz="4"/>
+              <w:right w:val="single" w:color="C5CCD3" w:sz="4"/>
+            </w:tcBorders>
+            <w:tcMar>
+              <w:top w:type="dxa" w:w="60"/>
+              <w:left w:type="dxa" w:w="100"/>
+              <w:bottom w:type="dxa" w:w="60"/>
+              <w:right w:type="dxa" w:w="100"/>
+            </w:tcMar>
+          </w:tcPr>
+          <w:p>
+            <w:r>
+              <w:rPr>
+                <w:b w:val="false"/>
+                <w:bCs w:val="false"/>
+                <w:sz w:val="19"/>
+                <w:szCs w:val="19"/>
+              </w:rPr>
+              <w:t xml:space="preserve">Masked or approved production-like data (D-ENV-04)</w:t>
+            </w:r>
+          </w:p>
+        </w:tc>
+        <w:tc>
+          <w:tcPr>
+            <w:tcW w:type="dxa" w:w="1974"/>
+            <w:tcBorders>
+              <w:top w:val="single" w:color="C5CCD3" w:sz="4"/>
+              <w:left w:val="single" w:color="C5CCD3" w:sz="4"/>
+              <w:bottom w:val="single" w:color="C5CCD3" w:sz="4"/>
+              <w:right w:val="single" w:color="C5CCD3" w:sz="4"/>
+            </w:tcBorders>
+            <w:tcMar>
+              <w:top w:type="dxa" w:w="60"/>
+              <w:left w:type="dxa" w:w="100"/>
+              <w:bottom w:type="dxa" w:w="60"/>
+              <w:right w:type="dxa" w:w="100"/>
+            </w:tcMar>
+          </w:tcPr>
+          <w:p>
+            <w:r>
+              <w:rPr>
+                <w:b w:val="false"/>
+                <w:bCs w:val="false"/>
+                <w:sz w:val="19"/>
+                <w:szCs w:val="19"/>
+              </w:rPr>
+              <w:t xml:space="preserve">Promotion only</w:t>
+            </w:r>
+          </w:p>
+        </w:tc>
+      </w:tr>
+      <w:tr>
+        <w:tc>
+          <w:tcPr>
+            <w:tcW w:type="dxa" w:w="1710"/>
+            <w:tcBorders>
+              <w:top w:val="single" w:color="C5CCD3" w:sz="4"/>
+              <w:left w:val="single" w:color="C5CCD3" w:sz="4"/>
+              <w:bottom w:val="single" w:color="C5CCD3" w:sz="4"/>
+              <w:right w:val="single" w:color="C5CCD3" w:sz="4"/>
+            </w:tcBorders>
+            <w:tcMar>
+              <w:top w:type="dxa" w:w="60"/>
+              <w:left w:type="dxa" w:w="100"/>
+              <w:bottom w:type="dxa" w:w="60"/>
+              <w:right w:type="dxa" w:w="100"/>
+            </w:tcMar>
+          </w:tcPr>
+          <w:p>
+            <w:r>
+              <w:rPr>
+                <w:b w:val="false"/>
+                <w:bCs w:val="false"/>
+                <w:sz w:val="19"/>
+                <w:szCs w:val="19"/>
+              </w:rPr>
+              <w:t xml:space="preserve">Production</w:t>
+            </w:r>
+          </w:p>
+        </w:tc>
+        <w:tc>
+          <w:tcPr>
+            <w:tcW w:type="dxa" w:w="1943"/>
+            <w:tcBorders>
+              <w:top w:val="single" w:color="C5CCD3" w:sz="4"/>
+              <w:left w:val="single" w:color="C5CCD3" w:sz="4"/>
+              <w:bottom w:val="single" w:color="C5CCD3" w:sz="4"/>
+              <w:right w:val="single" w:color="C5CCD3" w:sz="4"/>
+            </w:tcBorders>
+            <w:tcMar>
+              <w:top w:type="dxa" w:w="60"/>
+              <w:left w:type="dxa" w:w="100"/>
+              <w:bottom w:type="dxa" w:w="60"/>
+              <w:right w:type="dxa" w:w="100"/>
+            </w:tcMar>
+          </w:tcPr>
+          <w:p>
+            <w:r>
+              <w:rPr>
+                <w:b w:val="false"/>
+                <w:bCs w:val="false"/>
+                <w:sz w:val="19"/>
+                <w:szCs w:val="19"/>
+              </w:rPr>
+              <w:t xml:space="preserve">mft.&lt;domain&gt;</w:t>
+            </w:r>
+          </w:p>
+        </w:tc>
+        <w:tc>
+          <w:tcPr>
+            <w:tcW w:type="dxa" w:w="2121"/>
+            <w:tcBorders>
+              <w:top w:val="single" w:color="C5CCD3" w:sz="4"/>
+              <w:left w:val="single" w:color="C5CCD3" w:sz="4"/>
+              <w:bottom w:val="single" w:color="C5CCD3" w:sz="4"/>
+              <w:right w:val="single" w:color="C5CCD3" w:sz="4"/>
+            </w:tcBorders>
+            <w:tcMar>
+              <w:top w:type="dxa" w:w="60"/>
+              <w:left w:type="dxa" w:w="100"/>
+              <w:bottom w:type="dxa" w:w="60"/>
+              <w:right w:type="dxa" w:w="100"/>
+            </w:tcMar>
+          </w:tcPr>
+          <w:p>
+            <w:r>
+              <w:rPr>
+                <w:b w:val="false"/>
+                <w:bCs w:val="false"/>
+                <w:sz w:val="19"/>
+                <w:szCs w:val="19"/>
+              </w:rPr>
+              <w:t xml:space="preserve">Live transfers</w:t>
+            </w:r>
+          </w:p>
+        </w:tc>
+        <w:tc>
+          <w:tcPr>
+            <w:tcW w:type="dxa" w:w="1890"/>
+            <w:tcBorders>
+              <w:top w:val="single" w:color="C5CCD3" w:sz="4"/>
+              <w:left w:val="single" w:color="C5CCD3" w:sz="4"/>
+              <w:bottom w:val="single" w:color="C5CCD3" w:sz="4"/>
+              <w:right w:val="single" w:color="C5CCD3" w:sz="4"/>
+            </w:tcBorders>
+            <w:tcMar>
+              <w:top w:type="dxa" w:w="60"/>
+              <w:left w:type="dxa" w:w="100"/>
+              <w:bottom w:type="dxa" w:w="60"/>
+              <w:right w:type="dxa" w:w="100"/>
+            </w:tcMar>
+          </w:tcPr>
+          <w:p>
+            <w:r>
+              <w:rPr>
+                <w:b w:val="false"/>
+                <w:bCs w:val="false"/>
+                <w:sz w:val="19"/>
+                <w:szCs w:val="19"/>
+              </w:rPr>
+              <w:t xml:space="preserve">Live</w:t>
+            </w:r>
+          </w:p>
+        </w:tc>
+        <w:tc>
+          <w:tcPr>
+            <w:tcW w:type="dxa" w:w="1974"/>
+            <w:tcBorders>
+              <w:top w:val="single" w:color="C5CCD3" w:sz="4"/>
+              <w:left w:val="single" w:color="C5CCD3" w:sz="4"/>
+              <w:bottom w:val="single" w:color="C5CCD3" w:sz="4"/>
+              <w:right w:val="single" w:color="C5CCD3" w:sz="4"/>
+            </w:tcBorders>
+            <w:tcMar>
+              <w:top w:type="dxa" w:w="60"/>
+              <w:left w:type="dxa" w:w="100"/>
+              <w:bottom w:type="dxa" w:w="60"/>
+              <w:right w:type="dxa" w:w="100"/>
+            </w:tcMar>
+          </w:tcPr>
+          <w:p>
+            <w:r>
+              <w:rPr>
+                <w:b w:val="false"/>
+                <w:bCs w:val="false"/>
+                <w:sz w:val="19"/>
+                <w:szCs w:val="19"/>
+              </w:rPr>
+              <w:t xml:space="preserve">Promotion only, under change control</w:t>
+            </w:r>
+          </w:p>
+        </w:tc>
+      </w:tr>
+    </w:tbl>
+    <w:p>
+      <w:pPr>
+        <w:spacing w:after="60"/>
+      </w:pPr>
+    </w:p>
+    <w:p>
+      <w:pPr>
+        <w:pBdr>
+          <w:left w:val="single" w:color="7A5A00" w:sz="24" w:space="6"/>
+        </w:pBdr>
+        <w:shd w:fill="FDF3D6" w:color="auto" w:val="clear"/>
+        <w:spacing w:after="160" w:before="80"/>
+      </w:pPr>
+      <w:r>
+        <w:rPr>
+          <w:sz w:val="20"/>
+          <w:szCs w:val="20"/>
+        </w:rPr>
+        <w:t xml:space="preserve">Base URLs are a proposed pattern. Where vanity DNS names are already allocated, use those names and update this table to match.</w:t>
+      </w:r>
+    </w:p>
+    <w:p>
+      <w:pPr>
+        <w:pStyle w:val="Heading2"/>
+      </w:pPr>
+      <w:r>
+        <w:t xml:space="preserve">6.5 Summary of levels</w:t>
+      </w:r>
+    </w:p>
+    <w:tbl>
+      <w:tblPr>
+        <w:tblW w:type="dxa" w:w="9638"/>
+        <w:tblBorders>
+          <w:top w:val="single" w:color="auto" w:sz="4"/>
+          <w:left w:val="single" w:color="auto" w:sz="4"/>
+          <w:bottom w:val="single" w:color="auto" w:sz="4"/>
+          <w:right w:val="single" w:color="auto" w:sz="4"/>
+          <w:insideH w:val="single" w:color="auto" w:sz="4"/>
+          <w:insideV w:val="single" w:color="auto" w:sz="4"/>
+        </w:tblBorders>
+      </w:tblPr>
+      <w:tblGrid>
+        <w:gridCol w:w="1580"/>
+        <w:gridCol w:w="4422"/>
+        <w:gridCol w:w="3636"/>
+      </w:tblGrid>
+      <w:tr>
+        <w:trPr>
+          <w:tblHeader/>
+        </w:trPr>
+        <w:tc>
+          <w:tcPr>
+            <w:tcW w:type="dxa" w:w="1580"/>
+            <w:tcBorders>
+              <w:top w:val="single" w:color="C5CCD3" w:sz="4"/>
+              <w:left w:val="single" w:color="C5CCD3" w:sz="4"/>
+              <w:bottom w:val="single" w:color="C5CCD3" w:sz="4"/>
+              <w:right w:val="single" w:color="C5CCD3" w:sz="4"/>
+            </w:tcBorders>
+            <w:shd w:fill="E8F0FA" w:color="auto" w:val="clear"/>
+            <w:tcMar>
+              <w:top w:type="dxa" w:w="60"/>
+              <w:left w:type="dxa" w:w="100"/>
+              <w:bottom w:type="dxa" w:w="60"/>
+              <w:right w:type="dxa" w:w="100"/>
+            </w:tcMar>
+          </w:tcPr>
+          <w:p>
+            <w:r>
+              <w:rPr>
+                <w:b/>
+                <w:bCs/>
+                <w:sz w:val="19"/>
+                <w:szCs w:val="19"/>
+              </w:rPr>
+              <w:t xml:space="preserve">Level</w:t>
+            </w:r>
+          </w:p>
+        </w:tc>
+        <w:tc>
+          <w:tcPr>
+            <w:tcW w:type="dxa" w:w="4422"/>
+            <w:tcBorders>
+              <w:top w:val="single" w:color="C5CCD3" w:sz="4"/>
+              <w:left w:val="single" w:color="C5CCD3" w:sz="4"/>
+              <w:bottom w:val="single" w:color="C5CCD3" w:sz="4"/>
+              <w:right w:val="single" w:color="C5CCD3" w:sz="4"/>
+            </w:tcBorders>
+            <w:shd w:fill="E8F0FA" w:color="auto" w:val="clear"/>
+            <w:tcMar>
+              <w:top w:type="dxa" w:w="60"/>
+              <w:left w:type="dxa" w:w="100"/>
+              <w:bottom w:type="dxa" w:w="60"/>
+              <w:right w:type="dxa" w:w="100"/>
+            </w:tcMar>
+          </w:tcPr>
+          <w:p>
+            <w:r>
+              <w:rPr>
+                <w:b/>
+                <w:bCs/>
+                <w:sz w:val="19"/>
+                <w:szCs w:val="19"/>
+              </w:rPr>
+              <w:t xml:space="preserve">What it is</w:t>
+            </w:r>
+          </w:p>
+        </w:tc>
+        <w:tc>
+          <w:tcPr>
+            <w:tcW w:type="dxa" w:w="3636"/>
+            <w:tcBorders>
+              <w:top w:val="single" w:color="C5CCD3" w:sz="4"/>
+              <w:left w:val="single" w:color="C5CCD3" w:sz="4"/>
+              <w:bottom w:val="single" w:color="C5CCD3" w:sz="4"/>
+              <w:right w:val="single" w:color="C5CCD3" w:sz="4"/>
+            </w:tcBorders>
+            <w:shd w:fill="E8F0FA" w:color="auto" w:val="clear"/>
+            <w:tcMar>
+              <w:top w:type="dxa" w:w="60"/>
+              <w:left w:type="dxa" w:w="100"/>
+              <w:bottom w:type="dxa" w:w="60"/>
+              <w:right w:type="dxa" w:w="100"/>
+            </w:tcMar>
+          </w:tcPr>
+          <w:p>
+            <w:r>
+              <w:rPr>
+                <w:b/>
+                <w:bCs/>
+                <w:sz w:val="19"/>
+                <w:szCs w:val="19"/>
+              </w:rPr>
+              <w:t xml:space="preserve">On the programme</w:t>
+            </w:r>
+          </w:p>
+        </w:tc>
+      </w:tr>
+      <w:tr>
+        <w:tc>
+          <w:tcPr>
+            <w:tcW w:type="dxa" w:w="1580"/>
+            <w:tcBorders>
+              <w:top w:val="single" w:color="C5CCD3" w:sz="4"/>
+              <w:left w:val="single" w:color="C5CCD3" w:sz="4"/>
+              <w:bottom w:val="single" w:color="C5CCD3" w:sz="4"/>
+              <w:right w:val="single" w:color="C5CCD3" w:sz="4"/>
+            </w:tcBorders>
+            <w:tcMar>
+              <w:top w:type="dxa" w:w="60"/>
+              <w:left w:type="dxa" w:w="100"/>
+              <w:bottom w:type="dxa" w:w="60"/>
+              <w:right w:type="dxa" w:w="100"/>
+            </w:tcMar>
+          </w:tcPr>
+          <w:p>
+            <w:r>
+              <w:rPr>
+                <w:b w:val="false"/>
+                <w:bCs w:val="false"/>
+                <w:sz w:val="19"/>
+                <w:szCs w:val="19"/>
+              </w:rPr>
+              <w:t xml:space="preserve">Site</w:t>
+            </w:r>
+          </w:p>
+        </w:tc>
+        <w:tc>
+          <w:tcPr>
+            <w:tcW w:type="dxa" w:w="4422"/>
+            <w:tcBorders>
+              <w:top w:val="single" w:color="C5CCD3" w:sz="4"/>
+              <w:left w:val="single" w:color="C5CCD3" w:sz="4"/>
+              <w:bottom w:val="single" w:color="C5CCD3" w:sz="4"/>
+              <w:right w:val="single" w:color="C5CCD3" w:sz="4"/>
+            </w:tcBorders>
+            <w:tcMar>
+              <w:top w:type="dxa" w:w="60"/>
+              <w:left w:type="dxa" w:w="100"/>
+              <w:bottom w:type="dxa" w:w="60"/>
+              <w:right w:type="dxa" w:w="100"/>
+            </w:tcMar>
+          </w:tcPr>
+          <w:p>
+            <w:r>
+              <w:rPr>
+                <w:b w:val="false"/>
+                <w:bCs w:val="false"/>
+                <w:sz w:val="19"/>
+                <w:szCs w:val="19"/>
+              </w:rPr>
+              <w:t xml:space="preserve">One regional deployment with one base URL. Hosts one or many instances.</w:t>
+            </w:r>
+          </w:p>
+        </w:tc>
+        <w:tc>
+          <w:tcPr>
+            <w:tcW w:type="dxa" w:w="3636"/>
+            <w:tcBorders>
+              <w:top w:val="single" w:color="C5CCD3" w:sz="4"/>
+              <w:left w:val="single" w:color="C5CCD3" w:sz="4"/>
+              <w:bottom w:val="single" w:color="C5CCD3" w:sz="4"/>
+              <w:right w:val="single" w:color="C5CCD3" w:sz="4"/>
+            </w:tcBorders>
+            <w:tcMar>
+              <w:top w:type="dxa" w:w="60"/>
+              <w:left w:type="dxa" w:w="100"/>
+              <w:bottom w:type="dxa" w:w="60"/>
+              <w:right w:type="dxa" w:w="100"/>
+            </w:tcMar>
+          </w:tcPr>
+          <w:p>
+            <w:r>
+              <w:rPr>
+                <w:b w:val="false"/>
+                <w:bCs w:val="false"/>
+                <w:sz w:val="19"/>
+                <w:szCs w:val="19"/>
+              </w:rPr>
+              <w:t xml:space="preserve">One site per environment: development, test, pre-production, production</w:t>
+            </w:r>
+          </w:p>
+        </w:tc>
+      </w:tr>
+      <w:tr>
+        <w:tc>
+          <w:tcPr>
+            <w:tcW w:type="dxa" w:w="1580"/>
+            <w:tcBorders>
+              <w:top w:val="single" w:color="C5CCD3" w:sz="4"/>
+              <w:left w:val="single" w:color="C5CCD3" w:sz="4"/>
+              <w:bottom w:val="single" w:color="C5CCD3" w:sz="4"/>
+              <w:right w:val="single" w:color="C5CCD3" w:sz="4"/>
+            </w:tcBorders>
+            <w:tcMar>
+              <w:top w:type="dxa" w:w="60"/>
+              <w:left w:type="dxa" w:w="100"/>
+              <w:bottom w:type="dxa" w:w="60"/>
+              <w:right w:type="dxa" w:w="100"/>
+            </w:tcMar>
+          </w:tcPr>
+          <w:p>
+            <w:r>
+              <w:rPr>
+                <w:b w:val="false"/>
+                <w:bCs w:val="false"/>
+                <w:sz w:val="19"/>
+                <w:szCs w:val="19"/>
+              </w:rPr>
+              <w:t xml:space="preserve">Instance</w:t>
+            </w:r>
+          </w:p>
+        </w:tc>
+        <w:tc>
+          <w:tcPr>
+            <w:tcW w:type="dxa" w:w="4422"/>
+            <w:tcBorders>
+              <w:top w:val="single" w:color="C5CCD3" w:sz="4"/>
+              <w:left w:val="single" w:color="C5CCD3" w:sz="4"/>
+              <w:bottom w:val="single" w:color="C5CCD3" w:sz="4"/>
+              <w:right w:val="single" w:color="C5CCD3" w:sz="4"/>
+            </w:tcBorders>
+            <w:tcMar>
+              <w:top w:type="dxa" w:w="60"/>
+              <w:left w:type="dxa" w:w="100"/>
+              <w:bottom w:type="dxa" w:w="60"/>
+              <w:right w:type="dxa" w:w="100"/>
+            </w:tcMar>
+          </w:tcPr>
+          <w:p>
+            <w:r>
+              <w:rPr>
+                <w:b w:val="false"/>
+                <w:bCs w:val="false"/>
+                <w:sz w:val="19"/>
+                <w:szCs w:val="19"/>
+              </w:rPr>
+              <w:t xml:space="preserve">A logically isolated tenant. Cannot see or touch another instance's data, configuration or users.</w:t>
+            </w:r>
+          </w:p>
+        </w:tc>
+        <w:tc>
+          <w:tcPr>
+            <w:tcW w:type="dxa" w:w="3636"/>
+            <w:tcBorders>
+              <w:top w:val="single" w:color="C5CCD3" w:sz="4"/>
+              <w:left w:val="single" w:color="C5CCD3" w:sz="4"/>
+              <w:bottom w:val="single" w:color="C5CCD3" w:sz="4"/>
+              <w:right w:val="single" w:color="C5CCD3" w:sz="4"/>
+            </w:tcBorders>
+            <w:tcMar>
+              <w:top w:type="dxa" w:w="60"/>
+              <w:left w:type="dxa" w:w="100"/>
+              <w:bottom w:type="dxa" w:w="60"/>
+              <w:right w:type="dxa" w:w="100"/>
+            </w:tcMar>
+          </w:tcPr>
+          <w:p>
+            <w:r>
+              <w:rPr>
+                <w:b w:val="false"/>
+                <w:bCs w:val="false"/>
+                <w:sz w:val="19"/>
+                <w:szCs w:val="19"/>
+              </w:rPr>
+              <w:t xml:space="preserve">Three per site: Tax, Valuation Office, Borders and Trade</w:t>
+            </w:r>
+          </w:p>
+        </w:tc>
+      </w:tr>
+      <w:tr>
+        <w:tc>
+          <w:tcPr>
+            <w:tcW w:type="dxa" w:w="1580"/>
+            <w:tcBorders>
+              <w:top w:val="single" w:color="C5CCD3" w:sz="4"/>
+              <w:left w:val="single" w:color="C5CCD3" w:sz="4"/>
+              <w:bottom w:val="single" w:color="C5CCD3" w:sz="4"/>
+              <w:right w:val="single" w:color="C5CCD3" w:sz="4"/>
+            </w:tcBorders>
+            <w:tcMar>
+              <w:top w:type="dxa" w:w="60"/>
+              <w:left w:type="dxa" w:w="100"/>
+              <w:bottom w:type="dxa" w:w="60"/>
+              <w:right w:type="dxa" w:w="100"/>
+            </w:tcMar>
+          </w:tcPr>
+          <w:p>
+            <w:r>
+              <w:rPr>
+                <w:b w:val="false"/>
+                <w:bCs w:val="false"/>
+                <w:sz w:val="19"/>
+                <w:szCs w:val="19"/>
+              </w:rPr>
+              <w:t xml:space="preserve">Organization</w:t>
+            </w:r>
+          </w:p>
+        </w:tc>
+        <w:tc>
+          <w:tcPr>
+            <w:tcW w:type="dxa" w:w="4422"/>
+            <w:tcBorders>
+              <w:top w:val="single" w:color="C5CCD3" w:sz="4"/>
+              <w:left w:val="single" w:color="C5CCD3" w:sz="4"/>
+              <w:bottom w:val="single" w:color="C5CCD3" w:sz="4"/>
+              <w:right w:val="single" w:color="C5CCD3" w:sz="4"/>
+            </w:tcBorders>
+            <w:tcMar>
+              <w:top w:type="dxa" w:w="60"/>
+              <w:left w:type="dxa" w:w="100"/>
+              <w:bottom w:type="dxa" w:w="60"/>
+              <w:right w:type="dxa" w:w="100"/>
+            </w:tcMar>
+          </w:tcPr>
+          <w:p>
+            <w:r>
+              <w:rPr>
+                <w:b w:val="false"/>
+                <w:bCs w:val="false"/>
+                <w:sz w:val="19"/>
+                <w:szCs w:val="19"/>
+              </w:rPr>
+              <w:t xml:space="preserve">A business unit, product team or trading partner inside an instance. Owns its connections, flows and keys.</w:t>
+            </w:r>
+          </w:p>
+        </w:tc>
+        <w:tc>
+          <w:tcPr>
+            <w:tcW w:type="dxa" w:w="3636"/>
+            <w:tcBorders>
+              <w:top w:val="single" w:color="C5CCD3" w:sz="4"/>
+              <w:left w:val="single" w:color="C5CCD3" w:sz="4"/>
+              <w:bottom w:val="single" w:color="C5CCD3" w:sz="4"/>
+              <w:right w:val="single" w:color="C5CCD3" w:sz="4"/>
+            </w:tcBorders>
+            <w:tcMar>
+              <w:top w:type="dxa" w:w="60"/>
+              <w:left w:type="dxa" w:w="100"/>
+              <w:bottom w:type="dxa" w:w="60"/>
+              <w:right w:type="dxa" w:w="100"/>
+            </w:tcMar>
+          </w:tcPr>
+          <w:p>
+            <w:r>
+              <w:rPr>
+                <w:b w:val="false"/>
+                <w:bCs w:val="false"/>
+                <w:sz w:val="19"/>
+                <w:szCs w:val="19"/>
+              </w:rPr>
+              <w:t xml:space="preserve">One per product team or partner, created by the iPaaS team (section 7)</w:t>
+            </w:r>
+          </w:p>
+        </w:tc>
+      </w:tr>
+      <w:tr>
+        <w:tc>
+          <w:tcPr>
+            <w:tcW w:type="dxa" w:w="1580"/>
+            <w:tcBorders>
+              <w:top w:val="single" w:color="C5CCD3" w:sz="4"/>
+              <w:left w:val="single" w:color="C5CCD3" w:sz="4"/>
+              <w:bottom w:val="single" w:color="C5CCD3" w:sz="4"/>
+              <w:right w:val="single" w:color="C5CCD3" w:sz="4"/>
+            </w:tcBorders>
+            <w:tcMar>
+              <w:top w:type="dxa" w:w="60"/>
+              <w:left w:type="dxa" w:w="100"/>
+              <w:bottom w:type="dxa" w:w="60"/>
+              <w:right w:type="dxa" w:w="100"/>
+            </w:tcMar>
+          </w:tcPr>
+          <w:p>
+            <w:r>
+              <w:rPr>
+                <w:b w:val="false"/>
+                <w:bCs w:val="false"/>
+                <w:sz w:val="19"/>
+                <w:szCs w:val="19"/>
+              </w:rPr>
+              <w:t xml:space="preserve">Endpoints, users and machine users</w:t>
+            </w:r>
+          </w:p>
+        </w:tc>
+        <w:tc>
+          <w:tcPr>
+            <w:tcW w:type="dxa" w:w="4422"/>
+            <w:tcBorders>
+              <w:top w:val="single" w:color="C5CCD3" w:sz="4"/>
+              <w:left w:val="single" w:color="C5CCD3" w:sz="4"/>
+              <w:bottom w:val="single" w:color="C5CCD3" w:sz="4"/>
+              <w:right w:val="single" w:color="C5CCD3" w:sz="4"/>
+            </w:tcBorders>
+            <w:tcMar>
+              <w:top w:type="dxa" w:w="60"/>
+              <w:left w:type="dxa" w:w="100"/>
+              <w:bottom w:type="dxa" w:w="60"/>
+              <w:right w:type="dxa" w:w="100"/>
+            </w:tcMar>
+          </w:tcPr>
+          <w:p>
+            <w:r>
+              <w:rPr>
+                <w:b w:val="false"/>
+                <w:bCs w:val="false"/>
+                <w:sz w:val="19"/>
+                <w:szCs w:val="19"/>
+              </w:rPr>
+              <w:t xml:space="preserve">An organization's connection points, human accounts and service accounts, each scoped to that organization only.</w:t>
+            </w:r>
+          </w:p>
+        </w:tc>
+        <w:tc>
+          <w:tcPr>
+            <w:tcW w:type="dxa" w:w="3636"/>
+            <w:tcBorders>
+              <w:top w:val="single" w:color="C5CCD3" w:sz="4"/>
+              <w:left w:val="single" w:color="C5CCD3" w:sz="4"/>
+              <w:bottom w:val="single" w:color="C5CCD3" w:sz="4"/>
+              <w:right w:val="single" w:color="C5CCD3" w:sz="4"/>
+            </w:tcBorders>
+            <w:tcMar>
+              <w:top w:type="dxa" w:w="60"/>
+              <w:left w:type="dxa" w:w="100"/>
+              <w:bottom w:type="dxa" w:w="60"/>
+              <w:right w:type="dxa" w:w="100"/>
+            </w:tcMar>
+          </w:tcPr>
+          <w:p>
+            <w:r>
+              <w:rPr>
+                <w:b w:val="false"/>
+                <w:bCs w:val="false"/>
+                <w:sz w:val="19"/>
+                <w:szCs w:val="19"/>
+              </w:rPr>
+              <w:t xml:space="preserve">Endpoints by the team's Standard_Admin, flows by its Standard_User (section 7)</w:t>
+            </w:r>
+          </w:p>
+        </w:tc>
+      </w:tr>
+    </w:tbl>
+    <w:p>
+      <w:pPr>
+        <w:spacing w:after="60"/>
+      </w:pPr>
+    </w:p>
+    <w:p>
+      <w:pPr>
+        <w:pStyle w:val="Heading2"/>
+      </w:pPr>
+      <w:r>
+        <w:t xml:space="preserve">6.6 Rules</w:t>
       </w:r>
     </w:p>
     <w:p>
@@ -7393,7 +7657,7 @@
         </w:numPr>
       </w:pPr>
       <w:r>
-        <w:t xml:space="preserve">Each instance is set up the same way in every environment: the same organizations, endpoint names and flow names, with environment-specific values (hosts, paths, credentials). Promotion then changes values, not names.</w:t>
+        <w:t xml:space="preserve">Each instance is set up the same way on every site: the same organizations, endpoint names and flow names, with environment-specific values (hosts, paths, credentials). Promotion then changes values, not names.</w:t>
       </w:r>
     </w:p>
     <w:p>
@@ -7405,7 +7669,7 @@
         </w:numPr>
       </w:pPr>
       <w:r>
-        <w:t xml:space="preserve">No flow crosses an instance boundary. A transfer between business areas in different instances goes through a location both can reach, with a flow in each instance (D-ENV-01).</w:t>
+        <w:t xml:space="preserve">No flow crosses an instance boundary (D-ENV-01).</w:t>
       </w:r>
     </w:p>
     <w:p>
@@ -7417,7 +7681,7 @@
         </w:numPr>
       </w:pPr>
       <w:r>
-        <w:t xml:space="preserve">Live data only in prod. Dev and test use synthetic data; pre-prod data follows D-ENV-04.</w:t>
+        <w:t xml:space="preserve">Live data only in production. Development and test use synthetic data; pre-production data follows D-ENV-04.</w:t>
       </w:r>
     </w:p>
     <w:p>
@@ -7429,7 +7693,7 @@
         </w:numPr>
       </w:pPr>
       <w:r>
-        <w:t xml:space="preserve">MFT Nodes are created under an organization and are separate in each environment. A dev Node never serves test, pre-prod or prod. Whether one Node can serve several organizations or instances is to be confirmed with Boomi (D-ENV-02).</w:t>
+        <w:t xml:space="preserve">A development Node never serves test, pre-production or production.</w:t>
       </w:r>
     </w:p>
     <w:p>
@@ -7453,7 +7717,7 @@
         </w:numPr>
       </w:pPr>
       <w:r>
-        <w:t xml:space="preserve">Configuration moves dev, then test, then pre-prod, then prod. There is no native CI/CD for MFT configuration (G-13), so the promotion method is a decision (D-ENV-03; D-MVP-06 covers the MVP).</w:t>
+        <w:t xml:space="preserve">Configuration moves development, then test, then pre-production, then production. There is no native CI/CD for MFT configuration (G-13), so the promotion method is a decision (D-ENV-03; D-MVP-06 covers the MVP).</w:t>
       </w:r>
     </w:p>
     <w:p>
@@ -7461,7 +7725,7 @@
         <w:pStyle w:val="Heading2"/>
       </w:pPr>
       <w:r>
-        <w:t xml:space="preserve">6.5 Decisions</w:t>
+        <w:t xml:space="preserve">6.7 Decisions</w:t>
       </w:r>
     </w:p>
     <w:tbl>
@@ -7478,8 +7742,8 @@
       </w:tblPr>
       <w:tblGrid>
         <w:gridCol w:w="1080"/>
-        <w:gridCol w:w="6060"/>
-        <w:gridCol w:w="2498"/>
+        <w:gridCol w:w="6095"/>
+        <w:gridCol w:w="2463"/>
       </w:tblGrid>
       <w:tr>
         <w:trPr>
@@ -7516,7 +7780,7 @@
         </w:tc>
         <w:tc>
           <w:tcPr>
-            <w:tcW w:type="dxa" w:w="6060"/>
+            <w:tcW w:type="dxa" w:w="6095"/>
             <w:tcBorders>
               <w:top w:val="single" w:color="C5CCD3" w:sz="4"/>
               <w:left w:val="single" w:color="C5CCD3" w:sz="4"/>
@@ -7545,7 +7809,7 @@
         </w:tc>
         <w:tc>
           <w:tcPr>
-            <w:tcW w:type="dxa" w:w="2498"/>
+            <w:tcW w:type="dxa" w:w="2463"/>
             <w:tcBorders>
               <w:top w:val="single" w:color="C5CCD3" w:sz="4"/>
               <w:left w:val="single" w:color="C5CCD3" w:sz="4"/>
@@ -7604,7 +7868,7 @@
         </w:tc>
         <w:tc>
           <w:tcPr>
-            <w:tcW w:type="dxa" w:w="6060"/>
+            <w:tcW w:type="dxa" w:w="6095"/>
             <w:tcBorders>
               <w:top w:val="single" w:color="C5CCD3" w:sz="4"/>
               <w:left w:val="single" w:color="C5CCD3" w:sz="4"/>
@@ -7632,7 +7896,7 @@
         </w:tc>
         <w:tc>
           <w:tcPr>
-            <w:tcW w:type="dxa" w:w="2498"/>
+            <w:tcW w:type="dxa" w:w="2463"/>
             <w:tcBorders>
               <w:top w:val="single" w:color="C5CCD3" w:sz="4"/>
               <w:left w:val="single" w:color="C5CCD3" w:sz="4"/>
@@ -7690,35 +7954,35 @@
         </w:tc>
         <w:tc>
           <w:tcPr>
-            <w:tcW w:type="dxa" w:w="6060"/>
-            <w:tcBorders>
-              <w:top w:val="single" w:color="C5CCD3" w:sz="4"/>
-              <w:left w:val="single" w:color="C5CCD3" w:sz="4"/>
-              <w:bottom w:val="single" w:color="C5CCD3" w:sz="4"/>
-              <w:right w:val="single" w:color="C5CCD3" w:sz="4"/>
-            </w:tcBorders>
-            <w:tcMar>
-              <w:top w:type="dxa" w:w="60"/>
-              <w:left w:type="dxa" w:w="100"/>
-              <w:bottom w:type="dxa" w:w="60"/>
-              <w:right w:type="dxa" w:w="100"/>
-            </w:tcMar>
-          </w:tcPr>
-          <w:p>
-            <w:r>
-              <w:rPr>
-                <w:b w:val="false"/>
-                <w:bCs w:val="false"/>
-                <w:sz w:val="19"/>
-                <w:szCs w:val="19"/>
-              </w:rPr>
-              <w:t xml:space="preserve">MFT Node scope (per organization, instance or environment), count and sizing</w:t>
-            </w:r>
-          </w:p>
-        </w:tc>
-        <w:tc>
-          <w:tcPr>
-            <w:tcW w:type="dxa" w:w="2498"/>
+            <w:tcW w:type="dxa" w:w="6095"/>
+            <w:tcBorders>
+              <w:top w:val="single" w:color="C5CCD3" w:sz="4"/>
+              <w:left w:val="single" w:color="C5CCD3" w:sz="4"/>
+              <w:bottom w:val="single" w:color="C5CCD3" w:sz="4"/>
+              <w:right w:val="single" w:color="C5CCD3" w:sz="4"/>
+            </w:tcBorders>
+            <w:tcMar>
+              <w:top w:type="dxa" w:w="60"/>
+              <w:left w:type="dxa" w:w="100"/>
+              <w:bottom w:type="dxa" w:w="60"/>
+              <w:right w:type="dxa" w:w="100"/>
+            </w:tcMar>
+          </w:tcPr>
+          <w:p>
+            <w:r>
+              <w:rPr>
+                <w:b w:val="false"/>
+                <w:bCs w:val="false"/>
+                <w:sz w:val="19"/>
+                <w:szCs w:val="19"/>
+              </w:rPr>
+              <w:t xml:space="preserve">MFT Node count and sizing per instance and environment, and whether one Node can serve several organizations</w:t>
+            </w:r>
+          </w:p>
+        </w:tc>
+        <w:tc>
+          <w:tcPr>
+            <w:tcW w:type="dxa" w:w="2463"/>
             <w:tcBorders>
               <w:top w:val="single" w:color="C5CCD3" w:sz="4"/>
               <w:left w:val="single" w:color="C5CCD3" w:sz="4"/>
@@ -7776,7 +8040,7 @@
         </w:tc>
         <w:tc>
           <w:tcPr>
-            <w:tcW w:type="dxa" w:w="6060"/>
+            <w:tcW w:type="dxa" w:w="6095"/>
             <w:tcBorders>
               <w:top w:val="single" w:color="C5CCD3" w:sz="4"/>
               <w:left w:val="single" w:color="C5CCD3" w:sz="4"/>
@@ -7804,7 +8068,7 @@
         </w:tc>
         <w:tc>
           <w:tcPr>
-            <w:tcW w:type="dxa" w:w="2498"/>
+            <w:tcW w:type="dxa" w:w="2463"/>
             <w:tcBorders>
               <w:top w:val="single" w:color="C5CCD3" w:sz="4"/>
               <w:left w:val="single" w:color="C5CCD3" w:sz="4"/>
@@ -7862,35 +8126,35 @@
         </w:tc>
         <w:tc>
           <w:tcPr>
-            <w:tcW w:type="dxa" w:w="6060"/>
-            <w:tcBorders>
-              <w:top w:val="single" w:color="C5CCD3" w:sz="4"/>
-              <w:left w:val="single" w:color="C5CCD3" w:sz="4"/>
-              <w:bottom w:val="single" w:color="C5CCD3" w:sz="4"/>
-              <w:right w:val="single" w:color="C5CCD3" w:sz="4"/>
-            </w:tcBorders>
-            <w:tcMar>
-              <w:top w:type="dxa" w:w="60"/>
-              <w:left w:type="dxa" w:w="100"/>
-              <w:bottom w:type="dxa" w:w="60"/>
-              <w:right w:type="dxa" w:w="100"/>
-            </w:tcMar>
-          </w:tcPr>
-          <w:p>
-            <w:r>
-              <w:rPr>
-                <w:b w:val="false"/>
-                <w:bCs w:val="false"/>
-                <w:sz w:val="19"/>
-                <w:szCs w:val="19"/>
-              </w:rPr>
-              <w:t xml:space="preserve">Data allowed in pre-prod: masked, or approved production-like</w:t>
-            </w:r>
-          </w:p>
-        </w:tc>
-        <w:tc>
-          <w:tcPr>
-            <w:tcW w:type="dxa" w:w="2498"/>
+            <w:tcW w:type="dxa" w:w="6095"/>
+            <w:tcBorders>
+              <w:top w:val="single" w:color="C5CCD3" w:sz="4"/>
+              <w:left w:val="single" w:color="C5CCD3" w:sz="4"/>
+              <w:bottom w:val="single" w:color="C5CCD3" w:sz="4"/>
+              <w:right w:val="single" w:color="C5CCD3" w:sz="4"/>
+            </w:tcBorders>
+            <w:tcMar>
+              <w:top w:type="dxa" w:w="60"/>
+              <w:left w:type="dxa" w:w="100"/>
+              <w:bottom w:type="dxa" w:w="60"/>
+              <w:right w:type="dxa" w:w="100"/>
+            </w:tcMar>
+          </w:tcPr>
+          <w:p>
+            <w:r>
+              <w:rPr>
+                <w:b w:val="false"/>
+                <w:bCs w:val="false"/>
+                <w:sz w:val="19"/>
+                <w:szCs w:val="19"/>
+              </w:rPr>
+              <w:t xml:space="preserve">Data allowed in pre-production: masked, or approved production-like</w:t>
+            </w:r>
+          </w:p>
+        </w:tc>
+        <w:tc>
+          <w:tcPr>
+            <w:tcW w:type="dxa" w:w="2463"/>
             <w:tcBorders>
               <w:top w:val="single" w:color="C5CCD3" w:sz="4"/>
               <w:left w:val="single" w:color="C5CCD3" w:sz="4"/>
@@ -7913,6 +8177,178 @@
                 <w:szCs w:val="19"/>
               </w:rPr>
               <w:t xml:space="preserve">Data Protection Officer with Security Architect</w:t>
+            </w:r>
+          </w:p>
+        </w:tc>
+      </w:tr>
+      <w:tr>
+        <w:tc>
+          <w:tcPr>
+            <w:tcW w:type="dxa" w:w="1080"/>
+            <w:tcBorders>
+              <w:top w:val="single" w:color="C5CCD3" w:sz="4"/>
+              <w:left w:val="single" w:color="C5CCD3" w:sz="4"/>
+              <w:bottom w:val="single" w:color="C5CCD3" w:sz="4"/>
+              <w:right w:val="single" w:color="C5CCD3" w:sz="4"/>
+            </w:tcBorders>
+            <w:tcMar>
+              <w:top w:type="dxa" w:w="60"/>
+              <w:left w:type="dxa" w:w="100"/>
+              <w:bottom w:type="dxa" w:w="60"/>
+              <w:right w:type="dxa" w:w="100"/>
+            </w:tcMar>
+          </w:tcPr>
+          <w:p>
+            <w:r>
+              <w:rPr>
+                <w:b w:val="false"/>
+                <w:bCs w:val="false"/>
+                <w:sz w:val="19"/>
+                <w:szCs w:val="19"/>
+              </w:rPr>
+              <w:t xml:space="preserve">D-ENV-05</w:t>
+            </w:r>
+          </w:p>
+        </w:tc>
+        <w:tc>
+          <w:tcPr>
+            <w:tcW w:type="dxa" w:w="6095"/>
+            <w:tcBorders>
+              <w:top w:val="single" w:color="C5CCD3" w:sz="4"/>
+              <w:left w:val="single" w:color="C5CCD3" w:sz="4"/>
+              <w:bottom w:val="single" w:color="C5CCD3" w:sz="4"/>
+              <w:right w:val="single" w:color="C5CCD3" w:sz="4"/>
+            </w:tcBorders>
+            <w:tcMar>
+              <w:top w:type="dxa" w:w="60"/>
+              <w:left w:type="dxa" w:w="100"/>
+              <w:bottom w:type="dxa" w:w="60"/>
+              <w:right w:type="dxa" w:w="100"/>
+            </w:tcMar>
+          </w:tcPr>
+          <w:p>
+            <w:r>
+              <w:rPr>
+                <w:b w:val="false"/>
+                <w:bCs w:val="false"/>
+                <w:sz w:val="19"/>
+                <w:szCs w:val="19"/>
+              </w:rPr>
+              <w:t xml:space="preserve">Confirm the hosting region of each site and where files are held in transit</w:t>
+            </w:r>
+          </w:p>
+        </w:tc>
+        <w:tc>
+          <w:tcPr>
+            <w:tcW w:type="dxa" w:w="2463"/>
+            <w:tcBorders>
+              <w:top w:val="single" w:color="C5CCD3" w:sz="4"/>
+              <w:left w:val="single" w:color="C5CCD3" w:sz="4"/>
+              <w:bottom w:val="single" w:color="C5CCD3" w:sz="4"/>
+              <w:right w:val="single" w:color="C5CCD3" w:sz="4"/>
+            </w:tcBorders>
+            <w:tcMar>
+              <w:top w:type="dxa" w:w="60"/>
+              <w:left w:type="dxa" w:w="100"/>
+              <w:bottom w:type="dxa" w:w="60"/>
+              <w:right w:type="dxa" w:w="100"/>
+            </w:tcMar>
+          </w:tcPr>
+          <w:p>
+            <w:r>
+              <w:rPr>
+                <w:b w:val="false"/>
+                <w:bCs w:val="false"/>
+                <w:sz w:val="19"/>
+                <w:szCs w:val="19"/>
+              </w:rPr>
+              <w:t xml:space="preserve">Boomi Platform Owner with Security Architect</w:t>
+            </w:r>
+          </w:p>
+        </w:tc>
+      </w:tr>
+      <w:tr>
+        <w:tc>
+          <w:tcPr>
+            <w:tcW w:type="dxa" w:w="1080"/>
+            <w:tcBorders>
+              <w:top w:val="single" w:color="C5CCD3" w:sz="4"/>
+              <w:left w:val="single" w:color="C5CCD3" w:sz="4"/>
+              <w:bottom w:val="single" w:color="C5CCD3" w:sz="4"/>
+              <w:right w:val="single" w:color="C5CCD3" w:sz="4"/>
+            </w:tcBorders>
+            <w:tcMar>
+              <w:top w:type="dxa" w:w="60"/>
+              <w:left w:type="dxa" w:w="100"/>
+              <w:bottom w:type="dxa" w:w="60"/>
+              <w:right w:type="dxa" w:w="100"/>
+            </w:tcMar>
+          </w:tcPr>
+          <w:p>
+            <w:r>
+              <w:rPr>
+                <w:b w:val="false"/>
+                <w:bCs w:val="false"/>
+                <w:sz w:val="19"/>
+                <w:szCs w:val="19"/>
+              </w:rPr>
+              <w:t xml:space="preserve">D-ENV-06</w:t>
+            </w:r>
+          </w:p>
+        </w:tc>
+        <w:tc>
+          <w:tcPr>
+            <w:tcW w:type="dxa" w:w="6095"/>
+            <w:tcBorders>
+              <w:top w:val="single" w:color="C5CCD3" w:sz="4"/>
+              <w:left w:val="single" w:color="C5CCD3" w:sz="4"/>
+              <w:bottom w:val="single" w:color="C5CCD3" w:sz="4"/>
+              <w:right w:val="single" w:color="C5CCD3" w:sz="4"/>
+            </w:tcBorders>
+            <w:tcMar>
+              <w:top w:type="dxa" w:w="60"/>
+              <w:left w:type="dxa" w:w="100"/>
+              <w:bottom w:type="dxa" w:w="60"/>
+              <w:right w:type="dxa" w:w="100"/>
+            </w:tcMar>
+          </w:tcPr>
+          <w:p>
+            <w:r>
+              <w:rPr>
+                <w:b w:val="false"/>
+                <w:bCs w:val="false"/>
+                <w:sz w:val="19"/>
+                <w:szCs w:val="19"/>
+              </w:rPr>
+              <w:t xml:space="preserve">Confirm which settings are held per site and which per instance (sign-in and SSO, password policy, branding, IP restrictions)</w:t>
+            </w:r>
+          </w:p>
+        </w:tc>
+        <w:tc>
+          <w:tcPr>
+            <w:tcW w:type="dxa" w:w="2463"/>
+            <w:tcBorders>
+              <w:top w:val="single" w:color="C5CCD3" w:sz="4"/>
+              <w:left w:val="single" w:color="C5CCD3" w:sz="4"/>
+              <w:bottom w:val="single" w:color="C5CCD3" w:sz="4"/>
+              <w:right w:val="single" w:color="C5CCD3" w:sz="4"/>
+            </w:tcBorders>
+            <w:tcMar>
+              <w:top w:type="dxa" w:w="60"/>
+              <w:left w:type="dxa" w:w="100"/>
+              <w:bottom w:type="dxa" w:w="60"/>
+              <w:right w:type="dxa" w:w="100"/>
+            </w:tcMar>
+          </w:tcPr>
+          <w:p>
+            <w:r>
+              <w:rPr>
+                <w:b w:val="false"/>
+                <w:bCs w:val="false"/>
+                <w:sz w:val="19"/>
+                <w:szCs w:val="19"/>
+              </w:rPr>
+              <w:t xml:space="preserve">Boomi Platform Owner with Boomi</w:t>
             </w:r>
           </w:p>
         </w:tc>
@@ -16681,7 +17117,7 @@
           <w:numId w:val="2"/>
         </w:numPr>
       </w:pPr>
-      <w:hyperlink w:history="1" r:id="rId2kk48bk62s4ku4btrc7fo">
+      <w:hyperlink w:history="1" r:id="rIdda0cw5fbfy3-tey4b7lu-">
         <w:r>
           <w:rPr>
             <w:rStyle w:val="Hyperlink"/>
@@ -16706,7 +17142,7 @@
           <w:numId w:val="2"/>
         </w:numPr>
       </w:pPr>
-      <w:hyperlink w:history="1" r:id="rId0ckji80vcltomtfzdlaf5">
+      <w:hyperlink w:history="1" r:id="rIdhqawzdpilw_j1b4xi6bhj">
         <w:r>
           <w:rPr>
             <w:rStyle w:val="Hyperlink"/>
@@ -16731,7 +17167,7 @@
           <w:numId w:val="2"/>
         </w:numPr>
       </w:pPr>
-      <w:hyperlink w:history="1" r:id="rIde-tk_e2uorzqgosxlropy">
+      <w:hyperlink w:history="1" r:id="rIdjqlm7infgwh1xn_ezzsxq">
         <w:r>
           <w:rPr>
             <w:rStyle w:val="Hyperlink"/>
@@ -16756,7 +17192,7 @@
           <w:numId w:val="2"/>
         </w:numPr>
       </w:pPr>
-      <w:hyperlink w:history="1" r:id="rIdv7iwnkrrck2joo6kph5__">
+      <w:hyperlink w:history="1" r:id="rIdedurunyyzclnccmpjk23u">
         <w:r>
           <w:rPr>
             <w:rStyle w:val="Hyperlink"/>
@@ -16781,7 +17217,7 @@
           <w:numId w:val="2"/>
         </w:numPr>
       </w:pPr>
-      <w:hyperlink w:history="1" r:id="rIdj-jekvl62orx45quoudzn">
+      <w:hyperlink w:history="1" r:id="rIdpgnbrtqo8guofs0_ayqvw">
         <w:r>
           <w:rPr>
             <w:rStyle w:val="Hyperlink"/>
@@ -16806,7 +17242,7 @@
           <w:numId w:val="2"/>
         </w:numPr>
       </w:pPr>
-      <w:hyperlink w:history="1" r:id="rId3th9bzxujcbu3bi1lrxbd">
+      <w:hyperlink w:history="1" r:id="rIduq10ia0zpxdwrs3bfhff0">
         <w:r>
           <w:rPr>
             <w:rStyle w:val="Hyperlink"/>
@@ -16831,7 +17267,7 @@
           <w:numId w:val="2"/>
         </w:numPr>
       </w:pPr>
-      <w:hyperlink w:history="1" r:id="rIdqmvwongwan9rhjiebfxmc">
+      <w:hyperlink w:history="1" r:id="rIdfzyublsrbdbyv2o78zlgz">
         <w:r>
           <w:rPr>
             <w:rStyle w:val="Hyperlink"/>
@@ -16856,7 +17292,7 @@
           <w:numId w:val="2"/>
         </w:numPr>
       </w:pPr>
-      <w:hyperlink w:history="1" r:id="rIdpxjjrhsm11anu0ff43pwy">
+      <w:hyperlink w:history="1" r:id="rIdjrgulvjwzwsgaxsfvtykf">
         <w:r>
           <w:rPr>
             <w:rStyle w:val="Hyperlink"/>
@@ -17000,7 +17436,7 @@
         <w:sz w:val="16"/>
         <w:szCs w:val="16"/>
       </w:rPr>
-      <w:t xml:space="preserve">Boomi MFT Platform: Overview, AFT and FS | v0.2 (draft)</w:t>
+      <w:t xml:space="preserve">Boomi MFT Platform: Overview, AFT and FS | v0.3 (draft)</w:t>
     </w:r>
   </w:p>
 </w:hdr>

</xml_diff>

<commit_message>
Boomi MFT platform page v0.4 (draft): Figure 4 redrawn from the role design note diagram as role permission lanes (iPaaS, Standard_Admin, Standard_User, both roles), with a reading guide in section 7.3
Co-Authored-By: Claude Opus 5.5 <noreply@anthropic.com>
Claude-Session: https://claude.ai/code/session_01PPFc7XwZnyxxa3evFXiTE9
</commit_message>
<xml_diff>
--- a/assets/boomi-mft-platform-overview.docx
+++ b/assets/boomi-mft-platform-overview.docx
@@ -80,7 +80,7 @@
                 <w:sz w:val="19"/>
                 <w:szCs w:val="19"/>
               </w:rPr>
-              <w:t xml:space="preserve">Draft v0.3 (draft), 22 October 2026</w:t>
+              <w:t xml:space="preserve">Draft v0.4 (draft), 22 October 2026</w:t>
             </w:r>
           </w:p>
         </w:tc>
@@ -316,7 +316,7 @@
                 <w:sz w:val="19"/>
                 <w:szCs w:val="19"/>
               </w:rPr>
-              <w:t xml:space="preserve">v0.1: sections 1 to 5 and gaps, principles, references. v0.2: adds section 6 (instances and environments), 7 (roles and access) and 8 (naming conventions). v0.3: expands section 6 with fuller site and instance descriptions</w:t>
+              <w:t xml:space="preserve">v0.1: sections 1 to 5 and gaps, principles, references. v0.2: adds section 6 (instances and environments), 7 (roles and access) and 8 (naming conventions). v0.3: expands section 6 with fuller site and instance descriptions. v0.4: Figure 4 redrawn from the role design note diagram to show role permissions</w:t>
             </w:r>
           </w:p>
         </w:tc>
@@ -9262,7 +9262,7 @@
       <w:r>
         <w:drawing>
           <wp:inline distT="0" distB="0" distL="0" distR="0">
-            <wp:extent cx="6096000" cy="4076700"/>
+            <wp:extent cx="6096000" cy="3810000"/>
             <wp:effectExtent t="0" r="0" b="0" l="0"/>
             <wp:docPr id="3" name="" descr="" title=""/>
             <wp:cNvGraphicFramePr>
@@ -9287,7 +9287,7 @@
                   <pic:spPr bwMode="auto">
                     <a:xfrm>
                       <a:off x="0" y="0"/>
-                      <a:ext cx="6096000" cy="4076700"/>
+                      <a:ext cx="6096000" cy="3810000"/>
                     </a:xfrm>
                     <a:prstGeom prst="rect">
                       <a:avLst/>
@@ -9313,7 +9313,63 @@
           <w:sz w:val="18"/>
           <w:szCs w:val="18"/>
         </w:rPr>
-        <w:t xml:space="preserve">Figure 4. Approach B: a product team organization with its endpoints, flows and roles (source: boomi-mft-roles-approach-b.drawio)</w:t>
+        <w:t xml:space="preserve">Figure 4. Approach B role permissions, redrawn from the role design note diagram (source: boomi-mft-roles-permissions.drawio)</w:t>
+      </w:r>
+    </w:p>
+    <w:p>
+      <w:pPr>
+        <w:spacing w:after="120"/>
+      </w:pPr>
+      <w:r>
+        <w:t xml:space="preserve">How to read Figure 4: the organization row shows the endpoints one project uses (Source A, the iPaaS S3 staging area, Destination A and Destination B) and the three flows between them. Each lane below shows who does what, with every action placed under the endpoint or flow it creates.</w:t>
+      </w:r>
+    </w:p>
+    <w:p>
+      <w:pPr>
+        <w:pStyle w:val="ListParagraph"/>
+        <w:numPr>
+          <w:ilvl w:val="0"/>
+          <w:numId w:val="2"/>
+        </w:numPr>
+      </w:pPr>
+      <w:r>
+        <w:t xml:space="preserve">iPaaS platform team: creates the organization, assigns the Standard_Admin and Standard_User roles, grants access to other organizations on request, and sets up sites, instances and MFT runtimes.</w:t>
+      </w:r>
+    </w:p>
+    <w:p>
+      <w:pPr>
+        <w:pStyle w:val="ListParagraph"/>
+        <w:numPr>
+          <w:ilvl w:val="0"/>
+          <w:numId w:val="2"/>
+        </w:numPr>
+      </w:pPr>
+      <w:r>
+        <w:t xml:space="preserve">Standard_Admin (administrator): creates each organization endpoint, so connection details (protocol, host and port, credentials) are owned by the project lead.</w:t>
+      </w:r>
+    </w:p>
+    <w:p>
+      <w:pPr>
+        <w:pStyle w:val="ListParagraph"/>
+        <w:numPr>
+          <w:ilvl w:val="0"/>
+          <w:numId w:val="2"/>
+        </w:numPr>
+      </w:pPr>
+      <w:r>
+        <w:t xml:space="preserve">Standard_User (developer): creates Flow 1, Flow 2 and Flow 3, reusing the endpoints the administrator created. Developers cannot create endpoints or organizations.</w:t>
+      </w:r>
+    </w:p>
+    <w:p>
+      <w:pPr>
+        <w:pStyle w:val="ListParagraph"/>
+        <w:numPr>
+          <w:ilvl w:val="0"/>
+          <w:numId w:val="2"/>
+        </w:numPr>
+      </w:pPr>
+      <w:r>
+        <w:t xml:space="preserve">Both product roles: create keys and certificates and MFT runtimes (as in the role design note, see D-RA-01 and D-RA-02), and view alerts and file activity.</w:t>
       </w:r>
     </w:p>
     <w:tbl>
@@ -10321,7 +10377,7 @@
         <w:spacing w:after="120"/>
       </w:pPr>
       <w:r>
-        <w:t xml:space="preserve">As set out in the role design note, with the iPaaS column added. The comments flag where this page proposes a change.</w:t>
+        <w:t xml:space="preserve">As set out in the role design note, with the iPaaS column added. Figure 4 shows the same permissions on the project diagram. The comments flag where this page proposes a change.</w:t>
       </w:r>
     </w:p>
     <w:tbl>
@@ -17117,7 +17173,7 @@
           <w:numId w:val="2"/>
         </w:numPr>
       </w:pPr>
-      <w:hyperlink w:history="1" r:id="rIdda0cw5fbfy3-tey4b7lu-">
+      <w:hyperlink w:history="1" r:id="rIdsfvmuprb352lhjnlyd7e6">
         <w:r>
           <w:rPr>
             <w:rStyle w:val="Hyperlink"/>
@@ -17142,7 +17198,7 @@
           <w:numId w:val="2"/>
         </w:numPr>
       </w:pPr>
-      <w:hyperlink w:history="1" r:id="rIdhqawzdpilw_j1b4xi6bhj">
+      <w:hyperlink w:history="1" r:id="rIdvfow8n5yit6te9draoycn">
         <w:r>
           <w:rPr>
             <w:rStyle w:val="Hyperlink"/>
@@ -17167,7 +17223,7 @@
           <w:numId w:val="2"/>
         </w:numPr>
       </w:pPr>
-      <w:hyperlink w:history="1" r:id="rIdjqlm7infgwh1xn_ezzsxq">
+      <w:hyperlink w:history="1" r:id="rIdlziphzxwgjj3w-yomst_s">
         <w:r>
           <w:rPr>
             <w:rStyle w:val="Hyperlink"/>
@@ -17192,7 +17248,7 @@
           <w:numId w:val="2"/>
         </w:numPr>
       </w:pPr>
-      <w:hyperlink w:history="1" r:id="rIdedurunyyzclnccmpjk23u">
+      <w:hyperlink w:history="1" r:id="rIdiynupa6i1wb6fjx18urww">
         <w:r>
           <w:rPr>
             <w:rStyle w:val="Hyperlink"/>
@@ -17217,7 +17273,7 @@
           <w:numId w:val="2"/>
         </w:numPr>
       </w:pPr>
-      <w:hyperlink w:history="1" r:id="rIdpgnbrtqo8guofs0_ayqvw">
+      <w:hyperlink w:history="1" r:id="rIdul2c_snz_jam_yxw6khn4">
         <w:r>
           <w:rPr>
             <w:rStyle w:val="Hyperlink"/>
@@ -17242,7 +17298,7 @@
           <w:numId w:val="2"/>
         </w:numPr>
       </w:pPr>
-      <w:hyperlink w:history="1" r:id="rIduq10ia0zpxdwrs3bfhff0">
+      <w:hyperlink w:history="1" r:id="rId1isceqvvjwsqmwhr1rbyf">
         <w:r>
           <w:rPr>
             <w:rStyle w:val="Hyperlink"/>
@@ -17267,7 +17323,7 @@
           <w:numId w:val="2"/>
         </w:numPr>
       </w:pPr>
-      <w:hyperlink w:history="1" r:id="rIdfzyublsrbdbyv2o78zlgz">
+      <w:hyperlink w:history="1" r:id="rIdvfcuimwi1te6t40vtojae">
         <w:r>
           <w:rPr>
             <w:rStyle w:val="Hyperlink"/>
@@ -17292,7 +17348,7 @@
           <w:numId w:val="2"/>
         </w:numPr>
       </w:pPr>
-      <w:hyperlink w:history="1" r:id="rIdjrgulvjwzwsgaxsfvtykf">
+      <w:hyperlink w:history="1" r:id="rIdxe3vnk7g7i7rrmwdvlsan">
         <w:r>
           <w:rPr>
             <w:rStyle w:val="Hyperlink"/>
@@ -17436,7 +17492,7 @@
         <w:sz w:val="16"/>
         <w:szCs w:val="16"/>
       </w:rPr>
-      <w:t xml:space="preserve">Boomi MFT Platform: Overview, AFT and FS | v0.3 (draft)</w:t>
+      <w:t xml:space="preserve">Boomi MFT Platform: Overview, AFT and FS | v0.4 (draft)</w:t>
     </w:r>
   </w:p>
 </w:hdr>

</xml_diff>